<commit_message>
docs: sazba - tabulky vzdy na jedne strane, nadpisy a uvodni vety s obsahem
lib.js + build_manual.js: radky tabulky keepNext (krome posledniho) a keepLines, uvodni veta
s dvojteckou keepNext, kontrola vdov a sirotku. check_layout.ps1 (Word COM) hlida rozdelene
tabulky a nadpisy na konci strany - vsech 12 dokumentu bez nalezu (2 tabulky delsi nez strana).

Co-Authored-By: Claude Opus 5.5 <noreply@anthropic.com>
</commit_message>
<xml_diff>
--- a/04_docs/manual/ScadaViewer_Technical_Manual_EN.docx
+++ b/04_docs/manual/ScadaViewer_Technical_Manual_EN.docx
@@ -393,7 +393,7 @@
           <w:szCs w:val="20"/>
         </w:rPr>
         <w:alias w:val="Contents"/>
-        <w:id w:val="-1296363393"/>
+        <w:id w:val="-54236667"/>
       </w:sdtPr>
       <w:sdtEndPr/>
       <w:sdtContent>
@@ -422,7 +422,7 @@
           <w:r>
             <w:fldChar w:fldCharType="separate"/>
           </w:r>
-          <w:hyperlink w:anchor="_Toc244086846" w:history="1">
+          <w:hyperlink w:anchor="_Toc244090132" w:history="1">
             <w:r>
               <w:rPr>
                 <w:rStyle w:val="Hypertextovodkaz"/>
@@ -446,7 +446,7 @@
               <w:rPr>
                 <w:noProof/>
               </w:rPr>
-              <w:instrText xml:space="preserve"> PAGEREF _Toc244086846 \h </w:instrText>
+              <w:instrText xml:space="preserve"> PAGEREF _Toc244090132 \h </w:instrText>
             </w:r>
             <w:r>
               <w:rPr>
@@ -489,7 +489,7 @@
               <w14:ligatures w14:val="standardContextual"/>
             </w:rPr>
           </w:pPr>
-          <w:hyperlink w:anchor="_Toc244086847" w:history="1">
+          <w:hyperlink w:anchor="_Toc244090133" w:history="1">
             <w:r>
               <w:rPr>
                 <w:rStyle w:val="Hypertextovodkaz"/>
@@ -513,7 +513,7 @@
               <w:rPr>
                 <w:noProof/>
               </w:rPr>
-              <w:instrText xml:space="preserve"> PAGEREF _Toc244086847 \h </w:instrText>
+              <w:instrText xml:space="preserve"> PAGEREF _Toc244090133 \h </w:instrText>
             </w:r>
             <w:r>
               <w:rPr>
@@ -556,7 +556,7 @@
               <w14:ligatures w14:val="standardContextual"/>
             </w:rPr>
           </w:pPr>
-          <w:hyperlink w:anchor="_Toc244086848" w:history="1">
+          <w:hyperlink w:anchor="_Toc244090134" w:history="1">
             <w:r>
               <w:rPr>
                 <w:rStyle w:val="Hypertextovodkaz"/>
@@ -580,7 +580,7 @@
               <w:rPr>
                 <w:noProof/>
               </w:rPr>
-              <w:instrText xml:space="preserve"> PAGEREF _Toc244086848 \h </w:instrText>
+              <w:instrText xml:space="preserve"> PAGEREF _Toc244090134 \h </w:instrText>
             </w:r>
             <w:r>
               <w:rPr>
@@ -597,7 +597,7 @@
               <w:rPr>
                 <w:noProof/>
               </w:rPr>
-              <w:t>3</w:t>
+              <w:t>4</w:t>
             </w:r>
             <w:r>
               <w:rPr>
@@ -623,7 +623,7 @@
               <w14:ligatures w14:val="standardContextual"/>
             </w:rPr>
           </w:pPr>
-          <w:hyperlink w:anchor="_Toc244086849" w:history="1">
+          <w:hyperlink w:anchor="_Toc244090135" w:history="1">
             <w:r>
               <w:rPr>
                 <w:rStyle w:val="Hypertextovodkaz"/>
@@ -647,7 +647,7 @@
               <w:rPr>
                 <w:noProof/>
               </w:rPr>
-              <w:instrText xml:space="preserve"> PAGEREF _Toc244086849 \h </w:instrText>
+              <w:instrText xml:space="preserve"> PAGEREF _Toc244090135 \h </w:instrText>
             </w:r>
             <w:r>
               <w:rPr>
@@ -690,7 +690,7 @@
               <w14:ligatures w14:val="standardContextual"/>
             </w:rPr>
           </w:pPr>
-          <w:hyperlink w:anchor="_Toc244086850" w:history="1">
+          <w:hyperlink w:anchor="_Toc244090136" w:history="1">
             <w:r>
               <w:rPr>
                 <w:rStyle w:val="Hypertextovodkaz"/>
@@ -714,7 +714,7 @@
               <w:rPr>
                 <w:noProof/>
               </w:rPr>
-              <w:instrText xml:space="preserve"> PAGEREF _Toc244086850 \h </w:instrText>
+              <w:instrText xml:space="preserve"> PAGEREF _Toc244090136 \h </w:instrText>
             </w:r>
             <w:r>
               <w:rPr>
@@ -731,7 +731,7 @@
               <w:rPr>
                 <w:noProof/>
               </w:rPr>
-              <w:t>4</w:t>
+              <w:t>5</w:t>
             </w:r>
             <w:r>
               <w:rPr>
@@ -757,7 +757,7 @@
               <w14:ligatures w14:val="standardContextual"/>
             </w:rPr>
           </w:pPr>
-          <w:hyperlink w:anchor="_Toc244086851" w:history="1">
+          <w:hyperlink w:anchor="_Toc244090137" w:history="1">
             <w:r>
               <w:rPr>
                 <w:rStyle w:val="Hypertextovodkaz"/>
@@ -781,7 +781,7 @@
               <w:rPr>
                 <w:noProof/>
               </w:rPr>
-              <w:instrText xml:space="preserve"> PAGEREF _Toc244086851 \h </w:instrText>
+              <w:instrText xml:space="preserve"> PAGEREF _Toc244090137 \h </w:instrText>
             </w:r>
             <w:r>
               <w:rPr>
@@ -824,7 +824,7 @@
               <w14:ligatures w14:val="standardContextual"/>
             </w:rPr>
           </w:pPr>
-          <w:hyperlink w:anchor="_Toc244086852" w:history="1">
+          <w:hyperlink w:anchor="_Toc244090138" w:history="1">
             <w:r>
               <w:rPr>
                 <w:rStyle w:val="Hypertextovodkaz"/>
@@ -848,7 +848,7 @@
               <w:rPr>
                 <w:noProof/>
               </w:rPr>
-              <w:instrText xml:space="preserve"> PAGEREF _Toc244086852 \h </w:instrText>
+              <w:instrText xml:space="preserve"> PAGEREF _Toc244090138 \h </w:instrText>
             </w:r>
             <w:r>
               <w:rPr>
@@ -865,7 +865,7 @@
               <w:rPr>
                 <w:noProof/>
               </w:rPr>
-              <w:t>5</w:t>
+              <w:t>6</w:t>
             </w:r>
             <w:r>
               <w:rPr>
@@ -891,7 +891,7 @@
               <w14:ligatures w14:val="standardContextual"/>
             </w:rPr>
           </w:pPr>
-          <w:hyperlink w:anchor="_Toc244086853" w:history="1">
+          <w:hyperlink w:anchor="_Toc244090139" w:history="1">
             <w:r>
               <w:rPr>
                 <w:rStyle w:val="Hypertextovodkaz"/>
@@ -915,7 +915,7 @@
               <w:rPr>
                 <w:noProof/>
               </w:rPr>
-              <w:instrText xml:space="preserve"> PAGEREF _Toc244086853 \h </w:instrText>
+              <w:instrText xml:space="preserve"> PAGEREF _Toc244090139 \h </w:instrText>
             </w:r>
             <w:r>
               <w:rPr>
@@ -932,7 +932,7 @@
               <w:rPr>
                 <w:noProof/>
               </w:rPr>
-              <w:t>5</w:t>
+              <w:t>6</w:t>
             </w:r>
             <w:r>
               <w:rPr>
@@ -958,7 +958,7 @@
               <w14:ligatures w14:val="standardContextual"/>
             </w:rPr>
           </w:pPr>
-          <w:hyperlink w:anchor="_Toc244086854" w:history="1">
+          <w:hyperlink w:anchor="_Toc244090140" w:history="1">
             <w:r>
               <w:rPr>
                 <w:rStyle w:val="Hypertextovodkaz"/>
@@ -982,7 +982,7 @@
               <w:rPr>
                 <w:noProof/>
               </w:rPr>
-              <w:instrText xml:space="preserve"> PAGEREF _Toc244086854 \h </w:instrText>
+              <w:instrText xml:space="preserve"> PAGEREF _Toc244090140 \h </w:instrText>
             </w:r>
             <w:r>
               <w:rPr>
@@ -999,7 +999,7 @@
               <w:rPr>
                 <w:noProof/>
               </w:rPr>
-              <w:t>5</w:t>
+              <w:t>6</w:t>
             </w:r>
             <w:r>
               <w:rPr>
@@ -1025,7 +1025,7 @@
               <w14:ligatures w14:val="standardContextual"/>
             </w:rPr>
           </w:pPr>
-          <w:hyperlink w:anchor="_Toc244086855" w:history="1">
+          <w:hyperlink w:anchor="_Toc244090141" w:history="1">
             <w:r>
               <w:rPr>
                 <w:rStyle w:val="Hypertextovodkaz"/>
@@ -1049,7 +1049,7 @@
               <w:rPr>
                 <w:noProof/>
               </w:rPr>
-              <w:instrText xml:space="preserve"> PAGEREF _Toc244086855 \h </w:instrText>
+              <w:instrText xml:space="preserve"> PAGEREF _Toc244090141 \h </w:instrText>
             </w:r>
             <w:r>
               <w:rPr>
@@ -1092,7 +1092,7 @@
               <w14:ligatures w14:val="standardContextual"/>
             </w:rPr>
           </w:pPr>
-          <w:hyperlink w:anchor="_Toc244086856" w:history="1">
+          <w:hyperlink w:anchor="_Toc244090142" w:history="1">
             <w:r>
               <w:rPr>
                 <w:rStyle w:val="Hypertextovodkaz"/>
@@ -1116,7 +1116,7 @@
               <w:rPr>
                 <w:noProof/>
               </w:rPr>
-              <w:instrText xml:space="preserve"> PAGEREF _Toc244086856 \h </w:instrText>
+              <w:instrText xml:space="preserve"> PAGEREF _Toc244090142 \h </w:instrText>
             </w:r>
             <w:r>
               <w:rPr>
@@ -1159,7 +1159,7 @@
               <w14:ligatures w14:val="standardContextual"/>
             </w:rPr>
           </w:pPr>
-          <w:hyperlink w:anchor="_Toc244086857" w:history="1">
+          <w:hyperlink w:anchor="_Toc244090143" w:history="1">
             <w:r>
               <w:rPr>
                 <w:rStyle w:val="Hypertextovodkaz"/>
@@ -1183,7 +1183,7 @@
               <w:rPr>
                 <w:noProof/>
               </w:rPr>
-              <w:instrText xml:space="preserve"> PAGEREF _Toc244086857 \h </w:instrText>
+              <w:instrText xml:space="preserve"> PAGEREF _Toc244090143 \h </w:instrText>
             </w:r>
             <w:r>
               <w:rPr>
@@ -1226,7 +1226,7 @@
               <w14:ligatures w14:val="standardContextual"/>
             </w:rPr>
           </w:pPr>
-          <w:hyperlink w:anchor="_Toc244086858" w:history="1">
+          <w:hyperlink w:anchor="_Toc244090144" w:history="1">
             <w:r>
               <w:rPr>
                 <w:rStyle w:val="Hypertextovodkaz"/>
@@ -1250,7 +1250,7 @@
               <w:rPr>
                 <w:noProof/>
               </w:rPr>
-              <w:instrText xml:space="preserve"> PAGEREF _Toc244086858 \h </w:instrText>
+              <w:instrText xml:space="preserve"> PAGEREF _Toc244090144 \h </w:instrText>
             </w:r>
             <w:r>
               <w:rPr>
@@ -1267,7 +1267,7 @@
               <w:rPr>
                 <w:noProof/>
               </w:rPr>
-              <w:t>7</w:t>
+              <w:t>8</w:t>
             </w:r>
             <w:r>
               <w:rPr>
@@ -1293,7 +1293,7 @@
               <w14:ligatures w14:val="standardContextual"/>
             </w:rPr>
           </w:pPr>
-          <w:hyperlink w:anchor="_Toc244086859" w:history="1">
+          <w:hyperlink w:anchor="_Toc244090145" w:history="1">
             <w:r>
               <w:rPr>
                 <w:rStyle w:val="Hypertextovodkaz"/>
@@ -1317,7 +1317,7 @@
               <w:rPr>
                 <w:noProof/>
               </w:rPr>
-              <w:instrText xml:space="preserve"> PAGEREF _Toc244086859 \h </w:instrText>
+              <w:instrText xml:space="preserve"> PAGEREF _Toc244090145 \h </w:instrText>
             </w:r>
             <w:r>
               <w:rPr>
@@ -1334,7 +1334,7 @@
               <w:rPr>
                 <w:noProof/>
               </w:rPr>
-              <w:t>7</w:t>
+              <w:t>8</w:t>
             </w:r>
             <w:r>
               <w:rPr>
@@ -1360,7 +1360,7 @@
               <w14:ligatures w14:val="standardContextual"/>
             </w:rPr>
           </w:pPr>
-          <w:hyperlink w:anchor="_Toc244086860" w:history="1">
+          <w:hyperlink w:anchor="_Toc244090146" w:history="1">
             <w:r>
               <w:rPr>
                 <w:rStyle w:val="Hypertextovodkaz"/>
@@ -1384,7 +1384,7 @@
               <w:rPr>
                 <w:noProof/>
               </w:rPr>
-              <w:instrText xml:space="preserve"> PAGEREF _Toc244086860 \h </w:instrText>
+              <w:instrText xml:space="preserve"> PAGEREF _Toc244090146 \h </w:instrText>
             </w:r>
             <w:r>
               <w:rPr>
@@ -1427,7 +1427,7 @@
               <w14:ligatures w14:val="standardContextual"/>
             </w:rPr>
           </w:pPr>
-          <w:hyperlink w:anchor="_Toc244086861" w:history="1">
+          <w:hyperlink w:anchor="_Toc244090147" w:history="1">
             <w:r>
               <w:rPr>
                 <w:rStyle w:val="Hypertextovodkaz"/>
@@ -1451,7 +1451,7 @@
               <w:rPr>
                 <w:noProof/>
               </w:rPr>
-              <w:instrText xml:space="preserve"> PAGEREF _Toc244086861 \h </w:instrText>
+              <w:instrText xml:space="preserve"> PAGEREF _Toc244090147 \h </w:instrText>
             </w:r>
             <w:r>
               <w:rPr>
@@ -1468,7 +1468,7 @@
               <w:rPr>
                 <w:noProof/>
               </w:rPr>
-              <w:t>8</w:t>
+              <w:t>9</w:t>
             </w:r>
             <w:r>
               <w:rPr>
@@ -1494,7 +1494,7 @@
               <w14:ligatures w14:val="standardContextual"/>
             </w:rPr>
           </w:pPr>
-          <w:hyperlink w:anchor="_Toc244086862" w:history="1">
+          <w:hyperlink w:anchor="_Toc244090148" w:history="1">
             <w:r>
               <w:rPr>
                 <w:rStyle w:val="Hypertextovodkaz"/>
@@ -1518,7 +1518,7 @@
               <w:rPr>
                 <w:noProof/>
               </w:rPr>
-              <w:instrText xml:space="preserve"> PAGEREF _Toc244086862 \h </w:instrText>
+              <w:instrText xml:space="preserve"> PAGEREF _Toc244090148 \h </w:instrText>
             </w:r>
             <w:r>
               <w:rPr>
@@ -1535,7 +1535,7 @@
               <w:rPr>
                 <w:noProof/>
               </w:rPr>
-              <w:t>8</w:t>
+              <w:t>9</w:t>
             </w:r>
             <w:r>
               <w:rPr>
@@ -1561,7 +1561,7 @@
               <w14:ligatures w14:val="standardContextual"/>
             </w:rPr>
           </w:pPr>
-          <w:hyperlink w:anchor="_Toc244086863" w:history="1">
+          <w:hyperlink w:anchor="_Toc244090149" w:history="1">
             <w:r>
               <w:rPr>
                 <w:rStyle w:val="Hypertextovodkaz"/>
@@ -1585,7 +1585,7 @@
               <w:rPr>
                 <w:noProof/>
               </w:rPr>
-              <w:instrText xml:space="preserve"> PAGEREF _Toc244086863 \h </w:instrText>
+              <w:instrText xml:space="preserve"> PAGEREF _Toc244090149 \h </w:instrText>
             </w:r>
             <w:r>
               <w:rPr>
@@ -1602,7 +1602,7 @@
               <w:rPr>
                 <w:noProof/>
               </w:rPr>
-              <w:t>8</w:t>
+              <w:t>9</w:t>
             </w:r>
             <w:r>
               <w:rPr>
@@ -1628,7 +1628,7 @@
               <w14:ligatures w14:val="standardContextual"/>
             </w:rPr>
           </w:pPr>
-          <w:hyperlink w:anchor="_Toc244086864" w:history="1">
+          <w:hyperlink w:anchor="_Toc244090150" w:history="1">
             <w:r>
               <w:rPr>
                 <w:rStyle w:val="Hypertextovodkaz"/>
@@ -1652,7 +1652,7 @@
               <w:rPr>
                 <w:noProof/>
               </w:rPr>
-              <w:instrText xml:space="preserve"> PAGEREF _Toc244086864 \h </w:instrText>
+              <w:instrText xml:space="preserve"> PAGEREF _Toc244090150 \h </w:instrText>
             </w:r>
             <w:r>
               <w:rPr>
@@ -1669,7 +1669,7 @@
               <w:rPr>
                 <w:noProof/>
               </w:rPr>
-              <w:t>8</w:t>
+              <w:t>9</w:t>
             </w:r>
             <w:r>
               <w:rPr>
@@ -1695,7 +1695,7 @@
               <w14:ligatures w14:val="standardContextual"/>
             </w:rPr>
           </w:pPr>
-          <w:hyperlink w:anchor="_Toc244086865" w:history="1">
+          <w:hyperlink w:anchor="_Toc244090151" w:history="1">
             <w:r>
               <w:rPr>
                 <w:rStyle w:val="Hypertextovodkaz"/>
@@ -1719,7 +1719,7 @@
               <w:rPr>
                 <w:noProof/>
               </w:rPr>
-              <w:instrText xml:space="preserve"> PAGEREF _Toc244086865 \h </w:instrText>
+              <w:instrText xml:space="preserve"> PAGEREF _Toc244090151 \h </w:instrText>
             </w:r>
             <w:r>
               <w:rPr>
@@ -1762,7 +1762,7 @@
               <w14:ligatures w14:val="standardContextual"/>
             </w:rPr>
           </w:pPr>
-          <w:hyperlink w:anchor="_Toc244086866" w:history="1">
+          <w:hyperlink w:anchor="_Toc244090152" w:history="1">
             <w:r>
               <w:rPr>
                 <w:rStyle w:val="Hypertextovodkaz"/>
@@ -1786,7 +1786,7 @@
               <w:rPr>
                 <w:noProof/>
               </w:rPr>
-              <w:instrText xml:space="preserve"> PAGEREF _Toc244086866 \h </w:instrText>
+              <w:instrText xml:space="preserve"> PAGEREF _Toc244090152 \h </w:instrText>
             </w:r>
             <w:r>
               <w:rPr>
@@ -1803,7 +1803,7 @@
               <w:rPr>
                 <w:noProof/>
               </w:rPr>
-              <w:t>9</w:t>
+              <w:t>10</w:t>
             </w:r>
             <w:r>
               <w:rPr>
@@ -1829,7 +1829,7 @@
               <w14:ligatures w14:val="standardContextual"/>
             </w:rPr>
           </w:pPr>
-          <w:hyperlink w:anchor="_Toc244086867" w:history="1">
+          <w:hyperlink w:anchor="_Toc244090153" w:history="1">
             <w:r>
               <w:rPr>
                 <w:rStyle w:val="Hypertextovodkaz"/>
@@ -1853,7 +1853,7 @@
               <w:rPr>
                 <w:noProof/>
               </w:rPr>
-              <w:instrText xml:space="preserve"> PAGEREF _Toc244086867 \h </w:instrText>
+              <w:instrText xml:space="preserve"> PAGEREF _Toc244090153 \h </w:instrText>
             </w:r>
             <w:r>
               <w:rPr>
@@ -1870,7 +1870,7 @@
               <w:rPr>
                 <w:noProof/>
               </w:rPr>
-              <w:t>9</w:t>
+              <w:t>10</w:t>
             </w:r>
             <w:r>
               <w:rPr>
@@ -1896,7 +1896,7 @@
               <w14:ligatures w14:val="standardContextual"/>
             </w:rPr>
           </w:pPr>
-          <w:hyperlink w:anchor="_Toc244086868" w:history="1">
+          <w:hyperlink w:anchor="_Toc244090154" w:history="1">
             <w:r>
               <w:rPr>
                 <w:rStyle w:val="Hypertextovodkaz"/>
@@ -1920,7 +1920,7 @@
               <w:rPr>
                 <w:noProof/>
               </w:rPr>
-              <w:instrText xml:space="preserve"> PAGEREF _Toc244086868 \h </w:instrText>
+              <w:instrText xml:space="preserve"> PAGEREF _Toc244090154 \h </w:instrText>
             </w:r>
             <w:r>
               <w:rPr>
@@ -1937,7 +1937,7 @@
               <w:rPr>
                 <w:noProof/>
               </w:rPr>
-              <w:t>10</w:t>
+              <w:t>11</w:t>
             </w:r>
             <w:r>
               <w:rPr>
@@ -1968,7 +1968,7 @@
       <w:pPr>
         <w:pStyle w:val="Nadpis1"/>
       </w:pPr>
-      <w:bookmarkStart w:id="0" w:name="_Toc244086846"/>
+      <w:bookmarkStart w:id="0" w:name="_Toc244090132"/>
       <w:r>
         <w:t>1  About this document</w:t>
       </w:r>
@@ -1999,6 +1999,7 @@
     </w:p>
     <w:p>
       <w:pPr>
+        <w:keepNext/>
         <w:spacing w:after="120" w:line="288" w:lineRule="auto"/>
       </w:pPr>
       <w:r>
@@ -2106,6 +2107,7 @@
     </w:p>
     <w:p>
       <w:pPr>
+        <w:keepNext/>
         <w:spacing w:after="120" w:line="288" w:lineRule="auto"/>
       </w:pPr>
       <w:r>
@@ -2242,6 +2244,8 @@
           </w:tcPr>
           <w:p>
             <w:pPr>
+              <w:keepNext/>
+              <w:keepLines/>
               <w:spacing w:line="252" w:lineRule="auto"/>
             </w:pPr>
             <w:r>
@@ -2276,6 +2280,8 @@
           </w:tcPr>
           <w:p>
             <w:pPr>
+              <w:keepNext/>
+              <w:keepLines/>
               <w:spacing w:line="252" w:lineRule="auto"/>
             </w:pPr>
             <w:r>
@@ -2310,6 +2316,8 @@
           </w:tcPr>
           <w:p>
             <w:pPr>
+              <w:keepNext/>
+              <w:keepLines/>
               <w:spacing w:line="252" w:lineRule="auto"/>
             </w:pPr>
             <w:r>
@@ -2348,6 +2356,7 @@
           </w:tcPr>
           <w:p>
             <w:pPr>
+              <w:keepLines/>
               <w:spacing w:line="252" w:lineRule="auto"/>
             </w:pPr>
             <w:r>
@@ -2378,6 +2387,7 @@
           </w:tcPr>
           <w:p>
             <w:pPr>
+              <w:keepLines/>
               <w:spacing w:line="252" w:lineRule="auto"/>
             </w:pPr>
             <w:r>
@@ -2408,6 +2418,7 @@
           </w:tcPr>
           <w:p>
             <w:pPr>
+              <w:keepLines/>
               <w:spacing w:line="252" w:lineRule="auto"/>
             </w:pPr>
             <w:r>
@@ -2431,7 +2442,7 @@
         <w:pStyle w:val="Nadpis1"/>
         <w:spacing w:before="480"/>
       </w:pPr>
-      <w:bookmarkStart w:id="1" w:name="_Toc244086847"/>
+      <w:bookmarkStart w:id="1" w:name="_Toc244090133"/>
       <w:r>
         <w:t>2  Operating principle</w:t>
       </w:r>
@@ -2482,7 +2493,7 @@
       <w:pPr>
         <w:pStyle w:val="Nadpis2"/>
       </w:pPr>
-      <w:bookmarkStart w:id="2" w:name="_Toc244086848"/>
+      <w:bookmarkStart w:id="2" w:name="_Toc244090134"/>
       <w:r>
         <w:t>2.1  Components</w:t>
       </w:r>
@@ -2553,6 +2564,8 @@
           </w:tcPr>
           <w:p>
             <w:pPr>
+              <w:keepNext/>
+              <w:keepLines/>
               <w:spacing w:line="252" w:lineRule="auto"/>
             </w:pPr>
             <w:r>
@@ -2587,6 +2600,8 @@
           </w:tcPr>
           <w:p>
             <w:pPr>
+              <w:keepNext/>
+              <w:keepLines/>
               <w:spacing w:line="252" w:lineRule="auto"/>
             </w:pPr>
             <w:r>
@@ -2625,6 +2640,8 @@
           </w:tcPr>
           <w:p>
             <w:pPr>
+              <w:keepNext/>
+              <w:keepLines/>
               <w:spacing w:line="252" w:lineRule="auto"/>
             </w:pPr>
             <w:r>
@@ -2655,6 +2672,8 @@
           </w:tcPr>
           <w:p>
             <w:pPr>
+              <w:keepNext/>
+              <w:keepLines/>
               <w:spacing w:line="252" w:lineRule="auto"/>
             </w:pPr>
             <w:r>
@@ -2720,6 +2739,8 @@
           </w:tcPr>
           <w:p>
             <w:pPr>
+              <w:keepNext/>
+              <w:keepLines/>
               <w:spacing w:line="252" w:lineRule="auto"/>
             </w:pPr>
             <w:r>
@@ -2750,6 +2771,8 @@
           </w:tcPr>
           <w:p>
             <w:pPr>
+              <w:keepNext/>
+              <w:keepLines/>
               <w:spacing w:line="252" w:lineRule="auto"/>
             </w:pPr>
             <w:r>
@@ -2785,6 +2808,8 @@
           </w:tcPr>
           <w:p>
             <w:pPr>
+              <w:keepNext/>
+              <w:keepLines/>
               <w:spacing w:line="252" w:lineRule="auto"/>
             </w:pPr>
             <w:r>
@@ -2815,6 +2840,8 @@
           </w:tcPr>
           <w:p>
             <w:pPr>
+              <w:keepNext/>
+              <w:keepLines/>
               <w:spacing w:line="252" w:lineRule="auto"/>
             </w:pPr>
             <w:r>
@@ -2850,6 +2877,8 @@
           </w:tcPr>
           <w:p>
             <w:pPr>
+              <w:keepNext/>
+              <w:keepLines/>
               <w:spacing w:line="252" w:lineRule="auto"/>
             </w:pPr>
             <w:r>
@@ -2880,6 +2909,8 @@
           </w:tcPr>
           <w:p>
             <w:pPr>
+              <w:keepNext/>
+              <w:keepLines/>
               <w:spacing w:line="252" w:lineRule="auto"/>
             </w:pPr>
             <w:r>
@@ -2930,6 +2961,8 @@
           </w:tcPr>
           <w:p>
             <w:pPr>
+              <w:keepNext/>
+              <w:keepLines/>
               <w:spacing w:line="252" w:lineRule="auto"/>
             </w:pPr>
             <w:r>
@@ -2960,6 +2993,8 @@
           </w:tcPr>
           <w:p>
             <w:pPr>
+              <w:keepNext/>
+              <w:keepLines/>
               <w:spacing w:line="252" w:lineRule="auto"/>
             </w:pPr>
             <w:r>
@@ -2995,6 +3030,7 @@
           </w:tcPr>
           <w:p>
             <w:pPr>
+              <w:keepLines/>
               <w:spacing w:line="252" w:lineRule="auto"/>
             </w:pPr>
             <w:r>
@@ -3025,6 +3061,7 @@
           </w:tcPr>
           <w:p>
             <w:pPr>
+              <w:keepLines/>
               <w:spacing w:line="252" w:lineRule="auto"/>
             </w:pPr>
             <w:r>
@@ -3047,7 +3084,7 @@
       <w:pPr>
         <w:pStyle w:val="Nadpis2"/>
       </w:pPr>
-      <w:bookmarkStart w:id="3" w:name="_Toc244086849"/>
+      <w:bookmarkStart w:id="3" w:name="_Toc244090135"/>
       <w:r>
         <w:t>2.2  Data sources</w:t>
       </w:r>
@@ -3119,6 +3156,8 @@
           </w:tcPr>
           <w:p>
             <w:pPr>
+              <w:keepNext/>
+              <w:keepLines/>
               <w:spacing w:line="252" w:lineRule="auto"/>
             </w:pPr>
             <w:r>
@@ -3153,6 +3192,8 @@
           </w:tcPr>
           <w:p>
             <w:pPr>
+              <w:keepNext/>
+              <w:keepLines/>
               <w:spacing w:line="252" w:lineRule="auto"/>
             </w:pPr>
             <w:r>
@@ -3187,6 +3228,8 @@
           </w:tcPr>
           <w:p>
             <w:pPr>
+              <w:keepNext/>
+              <w:keepLines/>
               <w:spacing w:line="252" w:lineRule="auto"/>
             </w:pPr>
             <w:r>
@@ -3225,6 +3268,8 @@
           </w:tcPr>
           <w:p>
             <w:pPr>
+              <w:keepNext/>
+              <w:keepLines/>
               <w:spacing w:line="252" w:lineRule="auto"/>
             </w:pPr>
             <w:r>
@@ -3255,6 +3300,8 @@
           </w:tcPr>
           <w:p>
             <w:pPr>
+              <w:keepNext/>
+              <w:keepLines/>
               <w:spacing w:line="252" w:lineRule="auto"/>
             </w:pPr>
             <w:r>
@@ -3286,6 +3333,8 @@
           </w:tcPr>
           <w:p>
             <w:pPr>
+              <w:keepNext/>
+              <w:keepLines/>
               <w:spacing w:line="252" w:lineRule="auto"/>
             </w:pPr>
             <w:r>
@@ -3321,6 +3370,8 @@
           </w:tcPr>
           <w:p>
             <w:pPr>
+              <w:keepNext/>
+              <w:keepLines/>
               <w:spacing w:line="252" w:lineRule="auto"/>
             </w:pPr>
             <w:r>
@@ -3351,6 +3402,8 @@
           </w:tcPr>
           <w:p>
             <w:pPr>
+              <w:keepNext/>
+              <w:keepLines/>
               <w:spacing w:line="252" w:lineRule="auto"/>
             </w:pPr>
             <w:r>
@@ -3397,6 +3450,8 @@
           </w:tcPr>
           <w:p>
             <w:pPr>
+              <w:keepNext/>
+              <w:keepLines/>
               <w:spacing w:line="252" w:lineRule="auto"/>
             </w:pPr>
             <w:r>
@@ -3447,6 +3502,8 @@
           </w:tcPr>
           <w:p>
             <w:pPr>
+              <w:keepNext/>
+              <w:keepLines/>
               <w:spacing w:line="252" w:lineRule="auto"/>
             </w:pPr>
             <w:r>
@@ -3477,6 +3534,8 @@
           </w:tcPr>
           <w:p>
             <w:pPr>
+              <w:keepNext/>
+              <w:keepLines/>
               <w:spacing w:line="252" w:lineRule="auto"/>
             </w:pPr>
             <w:r>
@@ -3508,6 +3567,8 @@
           </w:tcPr>
           <w:p>
             <w:pPr>
+              <w:keepNext/>
+              <w:keepLines/>
               <w:spacing w:line="252" w:lineRule="auto"/>
             </w:pPr>
             <w:r>
@@ -3543,6 +3604,7 @@
           </w:tcPr>
           <w:p>
             <w:pPr>
+              <w:keepLines/>
               <w:spacing w:line="252" w:lineRule="auto"/>
             </w:pPr>
             <w:r>
@@ -3573,6 +3635,7 @@
           </w:tcPr>
           <w:p>
             <w:pPr>
+              <w:keepLines/>
               <w:spacing w:line="252" w:lineRule="auto"/>
             </w:pPr>
             <w:r>
@@ -3604,6 +3667,7 @@
           </w:tcPr>
           <w:p>
             <w:pPr>
+              <w:keepLines/>
               <w:spacing w:line="252" w:lineRule="auto"/>
             </w:pPr>
             <w:r>
@@ -3667,7 +3731,7 @@
       <w:pPr>
         <w:pStyle w:val="Nadpis2"/>
       </w:pPr>
-      <w:bookmarkStart w:id="4" w:name="_Toc244086850"/>
+      <w:bookmarkStart w:id="4" w:name="_Toc244090136"/>
       <w:r>
         <w:t>2.3  Faults and outages</w:t>
       </w:r>
@@ -3738,6 +3802,8 @@
           </w:tcPr>
           <w:p>
             <w:pPr>
+              <w:keepNext/>
+              <w:keepLines/>
               <w:spacing w:line="252" w:lineRule="auto"/>
             </w:pPr>
             <w:r>
@@ -3772,6 +3838,8 @@
           </w:tcPr>
           <w:p>
             <w:pPr>
+              <w:keepNext/>
+              <w:keepLines/>
               <w:spacing w:line="252" w:lineRule="auto"/>
             </w:pPr>
             <w:r>
@@ -3810,6 +3878,8 @@
           </w:tcPr>
           <w:p>
             <w:pPr>
+              <w:keepNext/>
+              <w:keepLines/>
               <w:spacing w:line="252" w:lineRule="auto"/>
             </w:pPr>
             <w:r>
@@ -3840,6 +3910,8 @@
           </w:tcPr>
           <w:p>
             <w:pPr>
+              <w:keepNext/>
+              <w:keepLines/>
               <w:spacing w:line="252" w:lineRule="auto"/>
             </w:pPr>
             <w:r>
@@ -3875,6 +3947,8 @@
           </w:tcPr>
           <w:p>
             <w:pPr>
+              <w:keepNext/>
+              <w:keepLines/>
               <w:spacing w:line="252" w:lineRule="auto"/>
             </w:pPr>
             <w:r>
@@ -3905,6 +3979,8 @@
           </w:tcPr>
           <w:p>
             <w:pPr>
+              <w:keepNext/>
+              <w:keepLines/>
               <w:spacing w:line="252" w:lineRule="auto"/>
             </w:pPr>
             <w:r>
@@ -3940,6 +4016,8 @@
           </w:tcPr>
           <w:p>
             <w:pPr>
+              <w:keepNext/>
+              <w:keepLines/>
               <w:spacing w:line="252" w:lineRule="auto"/>
             </w:pPr>
             <w:r>
@@ -3970,6 +4048,8 @@
           </w:tcPr>
           <w:p>
             <w:pPr>
+              <w:keepNext/>
+              <w:keepLines/>
               <w:spacing w:line="252" w:lineRule="auto"/>
             </w:pPr>
             <w:r>
@@ -4005,6 +4085,8 @@
           </w:tcPr>
           <w:p>
             <w:pPr>
+              <w:keepNext/>
+              <w:keepLines/>
               <w:spacing w:line="252" w:lineRule="auto"/>
             </w:pPr>
             <w:r>
@@ -4043,6 +4125,8 @@
           </w:tcPr>
           <w:p>
             <w:pPr>
+              <w:keepNext/>
+              <w:keepLines/>
               <w:spacing w:line="252" w:lineRule="auto"/>
             </w:pPr>
             <w:r>
@@ -4093,6 +4177,7 @@
           </w:tcPr>
           <w:p>
             <w:pPr>
+              <w:keepLines/>
               <w:spacing w:line="252" w:lineRule="auto"/>
             </w:pPr>
             <w:r>
@@ -4123,6 +4208,7 @@
           </w:tcPr>
           <w:p>
             <w:pPr>
+              <w:keepLines/>
               <w:spacing w:line="252" w:lineRule="auto"/>
             </w:pPr>
             <w:r>
@@ -4146,7 +4232,7 @@
         <w:pStyle w:val="Nadpis1"/>
         <w:spacing w:before="480"/>
       </w:pPr>
-      <w:bookmarkStart w:id="5" w:name="_Toc244086851"/>
+      <w:bookmarkStart w:id="5" w:name="_Toc244090137"/>
       <w:r>
         <w:t>3  PLC interface</w:t>
       </w:r>
@@ -4260,6 +4346,8 @@
           </w:tcPr>
           <w:p>
             <w:pPr>
+              <w:keepNext/>
+              <w:keepLines/>
               <w:spacing w:line="252" w:lineRule="auto"/>
             </w:pPr>
             <w:r>
@@ -4294,6 +4382,8 @@
           </w:tcPr>
           <w:p>
             <w:pPr>
+              <w:keepNext/>
+              <w:keepLines/>
               <w:spacing w:line="252" w:lineRule="auto"/>
             </w:pPr>
             <w:r>
@@ -4328,6 +4418,8 @@
           </w:tcPr>
           <w:p>
             <w:pPr>
+              <w:keepNext/>
+              <w:keepLines/>
               <w:spacing w:line="252" w:lineRule="auto"/>
             </w:pPr>
             <w:r>
@@ -4362,6 +4454,8 @@
           </w:tcPr>
           <w:p>
             <w:pPr>
+              <w:keepNext/>
+              <w:keepLines/>
               <w:spacing w:line="252" w:lineRule="auto"/>
             </w:pPr>
             <w:r>
@@ -4400,6 +4494,8 @@
           </w:tcPr>
           <w:p>
             <w:pPr>
+              <w:keepNext/>
+              <w:keepLines/>
               <w:spacing w:line="252" w:lineRule="auto"/>
             </w:pPr>
             <w:r>
@@ -4431,6 +4527,8 @@
           </w:tcPr>
           <w:p>
             <w:pPr>
+              <w:keepNext/>
+              <w:keepLines/>
               <w:spacing w:line="252" w:lineRule="auto"/>
             </w:pPr>
             <w:r>
@@ -4461,6 +4559,8 @@
           </w:tcPr>
           <w:p>
             <w:pPr>
+              <w:keepNext/>
+              <w:keepLines/>
               <w:spacing w:line="252" w:lineRule="auto"/>
             </w:pPr>
             <w:r>
@@ -4491,6 +4591,8 @@
           </w:tcPr>
           <w:p>
             <w:pPr>
+              <w:keepNext/>
+              <w:keepLines/>
               <w:spacing w:line="252" w:lineRule="auto"/>
             </w:pPr>
             <w:r>
@@ -4526,6 +4628,8 @@
           </w:tcPr>
           <w:p>
             <w:pPr>
+              <w:keepNext/>
+              <w:keepLines/>
               <w:spacing w:line="252" w:lineRule="auto"/>
             </w:pPr>
             <w:r>
@@ -4557,6 +4661,8 @@
           </w:tcPr>
           <w:p>
             <w:pPr>
+              <w:keepNext/>
+              <w:keepLines/>
               <w:spacing w:line="252" w:lineRule="auto"/>
             </w:pPr>
             <w:r>
@@ -4587,6 +4693,8 @@
           </w:tcPr>
           <w:p>
             <w:pPr>
+              <w:keepNext/>
+              <w:keepLines/>
               <w:spacing w:line="252" w:lineRule="auto"/>
             </w:pPr>
             <w:r>
@@ -4617,6 +4725,8 @@
           </w:tcPr>
           <w:p>
             <w:pPr>
+              <w:keepNext/>
+              <w:keepLines/>
               <w:spacing w:line="252" w:lineRule="auto"/>
             </w:pPr>
             <w:r>
@@ -4652,6 +4762,8 @@
           </w:tcPr>
           <w:p>
             <w:pPr>
+              <w:keepNext/>
+              <w:keepLines/>
               <w:spacing w:line="252" w:lineRule="auto"/>
             </w:pPr>
             <w:r>
@@ -4683,6 +4795,8 @@
           </w:tcPr>
           <w:p>
             <w:pPr>
+              <w:keepNext/>
+              <w:keepLines/>
               <w:spacing w:line="252" w:lineRule="auto"/>
             </w:pPr>
             <w:r>
@@ -4713,6 +4827,8 @@
           </w:tcPr>
           <w:p>
             <w:pPr>
+              <w:keepNext/>
+              <w:keepLines/>
               <w:spacing w:line="252" w:lineRule="auto"/>
             </w:pPr>
             <w:r>
@@ -4743,6 +4859,8 @@
           </w:tcPr>
           <w:p>
             <w:pPr>
+              <w:keepNext/>
+              <w:keepLines/>
               <w:spacing w:line="252" w:lineRule="auto"/>
             </w:pPr>
             <w:r>
@@ -4778,6 +4896,8 @@
           </w:tcPr>
           <w:p>
             <w:pPr>
+              <w:keepNext/>
+              <w:keepLines/>
               <w:spacing w:line="252" w:lineRule="auto"/>
             </w:pPr>
             <w:r>
@@ -4809,6 +4929,8 @@
           </w:tcPr>
           <w:p>
             <w:pPr>
+              <w:keepNext/>
+              <w:keepLines/>
               <w:spacing w:line="252" w:lineRule="auto"/>
             </w:pPr>
             <w:r>
@@ -4839,6 +4961,8 @@
           </w:tcPr>
           <w:p>
             <w:pPr>
+              <w:keepNext/>
+              <w:keepLines/>
               <w:spacing w:line="252" w:lineRule="auto"/>
             </w:pPr>
             <w:r>
@@ -4869,6 +4993,8 @@
           </w:tcPr>
           <w:p>
             <w:pPr>
+              <w:keepNext/>
+              <w:keepLines/>
               <w:spacing w:line="252" w:lineRule="auto"/>
             </w:pPr>
             <w:r>
@@ -4904,6 +5030,8 @@
           </w:tcPr>
           <w:p>
             <w:pPr>
+              <w:keepNext/>
+              <w:keepLines/>
               <w:spacing w:line="252" w:lineRule="auto"/>
             </w:pPr>
             <w:r>
@@ -4935,6 +5063,8 @@
           </w:tcPr>
           <w:p>
             <w:pPr>
+              <w:keepNext/>
+              <w:keepLines/>
               <w:spacing w:line="252" w:lineRule="auto"/>
             </w:pPr>
             <w:r>
@@ -4965,6 +5095,8 @@
           </w:tcPr>
           <w:p>
             <w:pPr>
+              <w:keepNext/>
+              <w:keepLines/>
               <w:spacing w:line="252" w:lineRule="auto"/>
             </w:pPr>
             <w:r>
@@ -4995,6 +5127,8 @@
           </w:tcPr>
           <w:p>
             <w:pPr>
+              <w:keepNext/>
+              <w:keepLines/>
               <w:spacing w:line="252" w:lineRule="auto"/>
             </w:pPr>
             <w:r>
@@ -5030,6 +5164,7 @@
           </w:tcPr>
           <w:p>
             <w:pPr>
+              <w:keepLines/>
               <w:spacing w:line="252" w:lineRule="auto"/>
             </w:pPr>
             <w:r>
@@ -5061,6 +5196,7 @@
           </w:tcPr>
           <w:p>
             <w:pPr>
+              <w:keepLines/>
               <w:spacing w:line="252" w:lineRule="auto"/>
             </w:pPr>
             <w:r>
@@ -5091,6 +5227,7 @@
           </w:tcPr>
           <w:p>
             <w:pPr>
+              <w:keepLines/>
               <w:spacing w:line="252" w:lineRule="auto"/>
             </w:pPr>
             <w:r>
@@ -5121,6 +5258,7 @@
           </w:tcPr>
           <w:p>
             <w:pPr>
+              <w:keepLines/>
               <w:spacing w:line="252" w:lineRule="auto"/>
             </w:pPr>
             <w:r>
@@ -5174,7 +5312,7 @@
         <w:pStyle w:val="Nadpis1"/>
         <w:spacing w:before="480"/>
       </w:pPr>
-      <w:bookmarkStart w:id="6" w:name="_Toc244086852"/>
+      <w:bookmarkStart w:id="6" w:name="_Toc244090138"/>
       <w:r>
         <w:t>4  Users and access</w:t>
       </w:r>
@@ -5184,7 +5322,7 @@
       <w:pPr>
         <w:pStyle w:val="Nadpis2"/>
       </w:pPr>
-      <w:bookmarkStart w:id="7" w:name="_Toc244086853"/>
+      <w:bookmarkStart w:id="7" w:name="_Toc244090139"/>
       <w:r>
         <w:t>4.1  Roles</w:t>
       </w:r>
@@ -5256,6 +5394,8 @@
           </w:tcPr>
           <w:p>
             <w:pPr>
+              <w:keepNext/>
+              <w:keepLines/>
               <w:spacing w:line="252" w:lineRule="auto"/>
             </w:pPr>
             <w:r>
@@ -5290,6 +5430,8 @@
           </w:tcPr>
           <w:p>
             <w:pPr>
+              <w:keepNext/>
+              <w:keepLines/>
               <w:spacing w:line="252" w:lineRule="auto"/>
             </w:pPr>
             <w:r>
@@ -5324,6 +5466,8 @@
           </w:tcPr>
           <w:p>
             <w:pPr>
+              <w:keepNext/>
+              <w:keepLines/>
               <w:spacing w:line="252" w:lineRule="auto"/>
             </w:pPr>
             <w:r>
@@ -5362,6 +5506,8 @@
           </w:tcPr>
           <w:p>
             <w:pPr>
+              <w:keepNext/>
+              <w:keepLines/>
               <w:spacing w:line="252" w:lineRule="auto"/>
             </w:pPr>
             <w:r>
@@ -5392,6 +5538,8 @@
           </w:tcPr>
           <w:p>
             <w:pPr>
+              <w:keepNext/>
+              <w:keepLines/>
               <w:spacing w:line="252" w:lineRule="auto"/>
             </w:pPr>
             <w:r>
@@ -5422,6 +5570,8 @@
           </w:tcPr>
           <w:p>
             <w:pPr>
+              <w:keepNext/>
+              <w:keepLines/>
               <w:spacing w:line="252" w:lineRule="auto"/>
             </w:pPr>
             <w:r>
@@ -5457,6 +5607,8 @@
           </w:tcPr>
           <w:p>
             <w:pPr>
+              <w:keepNext/>
+              <w:keepLines/>
               <w:spacing w:line="252" w:lineRule="auto"/>
             </w:pPr>
             <w:r>
@@ -5487,6 +5639,8 @@
           </w:tcPr>
           <w:p>
             <w:pPr>
+              <w:keepNext/>
+              <w:keepLines/>
               <w:spacing w:line="252" w:lineRule="auto"/>
             </w:pPr>
             <w:r>
@@ -5517,6 +5671,8 @@
           </w:tcPr>
           <w:p>
             <w:pPr>
+              <w:keepNext/>
+              <w:keepLines/>
               <w:spacing w:line="252" w:lineRule="auto"/>
             </w:pPr>
             <w:r>
@@ -5552,6 +5708,8 @@
           </w:tcPr>
           <w:p>
             <w:pPr>
+              <w:keepNext/>
+              <w:keepLines/>
               <w:spacing w:line="252" w:lineRule="auto"/>
             </w:pPr>
             <w:r>
@@ -5582,6 +5740,8 @@
           </w:tcPr>
           <w:p>
             <w:pPr>
+              <w:keepNext/>
+              <w:keepLines/>
               <w:spacing w:line="252" w:lineRule="auto"/>
             </w:pPr>
             <w:r>
@@ -5612,6 +5772,8 @@
           </w:tcPr>
           <w:p>
             <w:pPr>
+              <w:keepNext/>
+              <w:keepLines/>
               <w:spacing w:line="252" w:lineRule="auto"/>
             </w:pPr>
             <w:r>
@@ -5647,6 +5809,7 @@
           </w:tcPr>
           <w:p>
             <w:pPr>
+              <w:keepLines/>
               <w:spacing w:line="252" w:lineRule="auto"/>
             </w:pPr>
             <w:r>
@@ -5677,6 +5840,7 @@
           </w:tcPr>
           <w:p>
             <w:pPr>
+              <w:keepLines/>
               <w:spacing w:line="252" w:lineRule="auto"/>
             </w:pPr>
             <w:r>
@@ -5707,6 +5871,7 @@
           </w:tcPr>
           <w:p>
             <w:pPr>
+              <w:keepLines/>
               <w:spacing w:line="252" w:lineRule="auto"/>
             </w:pPr>
             <w:r>
@@ -5770,7 +5935,7 @@
       <w:pPr>
         <w:pStyle w:val="Nadpis2"/>
       </w:pPr>
-      <w:bookmarkStart w:id="8" w:name="_Toc244086854"/>
+      <w:bookmarkStart w:id="8" w:name="_Toc244090140"/>
       <w:r>
         <w:t>4.2  At the tester and remotely</w:t>
       </w:r>
@@ -5907,7 +6072,7 @@
       <w:pPr>
         <w:pStyle w:val="Nadpis2"/>
       </w:pPr>
-      <w:bookmarkStart w:id="9" w:name="_Toc244086855"/>
+      <w:bookmarkStart w:id="9" w:name="_Toc244090141"/>
       <w:r>
         <w:t>4.3  Sign-in and sessions</w:t>
       </w:r>
@@ -6046,7 +6211,7 @@
         <w:pStyle w:val="Nadpis1"/>
         <w:spacing w:before="480"/>
       </w:pPr>
-      <w:bookmarkStart w:id="10" w:name="_Toc244086856"/>
+      <w:bookmarkStart w:id="10" w:name="_Toc244090142"/>
       <w:r>
         <w:t>5  REST API and WebSocket</w:t>
       </w:r>
@@ -6169,6 +6334,8 @@
           </w:tcPr>
           <w:p>
             <w:pPr>
+              <w:keepNext/>
+              <w:keepLines/>
               <w:spacing w:line="252" w:lineRule="auto"/>
             </w:pPr>
             <w:r>
@@ -6203,6 +6370,8 @@
           </w:tcPr>
           <w:p>
             <w:pPr>
+              <w:keepNext/>
+              <w:keepLines/>
               <w:spacing w:line="252" w:lineRule="auto"/>
             </w:pPr>
             <w:r>
@@ -6241,6 +6410,8 @@
           </w:tcPr>
           <w:p>
             <w:pPr>
+              <w:keepNext/>
+              <w:keepLines/>
               <w:spacing w:line="252" w:lineRule="auto"/>
             </w:pPr>
             <w:r>
@@ -6272,6 +6443,8 @@
           </w:tcPr>
           <w:p>
             <w:pPr>
+              <w:keepNext/>
+              <w:keepLines/>
               <w:spacing w:line="252" w:lineRule="auto"/>
             </w:pPr>
             <w:r>
@@ -6307,6 +6480,8 @@
           </w:tcPr>
           <w:p>
             <w:pPr>
+              <w:keepNext/>
+              <w:keepLines/>
               <w:spacing w:line="252" w:lineRule="auto"/>
             </w:pPr>
             <w:r>
@@ -6338,6 +6513,8 @@
           </w:tcPr>
           <w:p>
             <w:pPr>
+              <w:keepNext/>
+              <w:keepLines/>
               <w:spacing w:line="252" w:lineRule="auto"/>
             </w:pPr>
             <w:r>
@@ -6373,6 +6550,8 @@
           </w:tcPr>
           <w:p>
             <w:pPr>
+              <w:keepNext/>
+              <w:keepLines/>
               <w:spacing w:line="252" w:lineRule="auto"/>
             </w:pPr>
             <w:r>
@@ -6404,6 +6583,8 @@
           </w:tcPr>
           <w:p>
             <w:pPr>
+              <w:keepNext/>
+              <w:keepLines/>
               <w:spacing w:line="252" w:lineRule="auto"/>
             </w:pPr>
             <w:r>
@@ -6514,6 +6695,8 @@
           </w:tcPr>
           <w:p>
             <w:pPr>
+              <w:keepNext/>
+              <w:keepLines/>
               <w:spacing w:line="252" w:lineRule="auto"/>
             </w:pPr>
             <w:r>
@@ -6545,6 +6728,8 @@
           </w:tcPr>
           <w:p>
             <w:pPr>
+              <w:keepNext/>
+              <w:keepLines/>
               <w:spacing w:line="252" w:lineRule="auto"/>
             </w:pPr>
             <w:r>
@@ -6580,6 +6765,8 @@
           </w:tcPr>
           <w:p>
             <w:pPr>
+              <w:keepNext/>
+              <w:keepLines/>
               <w:spacing w:line="252" w:lineRule="auto"/>
             </w:pPr>
             <w:r>
@@ -6641,6 +6828,8 @@
           </w:tcPr>
           <w:p>
             <w:pPr>
+              <w:keepNext/>
+              <w:keepLines/>
               <w:spacing w:line="252" w:lineRule="auto"/>
             </w:pPr>
             <w:r>
@@ -6676,6 +6865,8 @@
           </w:tcPr>
           <w:p>
             <w:pPr>
+              <w:keepNext/>
+              <w:keepLines/>
               <w:spacing w:line="252" w:lineRule="auto"/>
             </w:pPr>
             <w:r>
@@ -6707,6 +6898,8 @@
           </w:tcPr>
           <w:p>
             <w:pPr>
+              <w:keepNext/>
+              <w:keepLines/>
               <w:spacing w:line="252" w:lineRule="auto"/>
             </w:pPr>
             <w:r>
@@ -6802,6 +6995,8 @@
           </w:tcPr>
           <w:p>
             <w:pPr>
+              <w:keepNext/>
+              <w:keepLines/>
               <w:spacing w:line="252" w:lineRule="auto"/>
             </w:pPr>
             <w:r>
@@ -6848,6 +7043,8 @@
           </w:tcPr>
           <w:p>
             <w:pPr>
+              <w:keepNext/>
+              <w:keepLines/>
               <w:spacing w:line="252" w:lineRule="auto"/>
             </w:pPr>
             <w:r>
@@ -6883,6 +7080,8 @@
           </w:tcPr>
           <w:p>
             <w:pPr>
+              <w:keepNext/>
+              <w:keepLines/>
               <w:spacing w:line="252" w:lineRule="auto"/>
             </w:pPr>
             <w:r>
@@ -6944,6 +7143,8 @@
           </w:tcPr>
           <w:p>
             <w:pPr>
+              <w:keepNext/>
+              <w:keepLines/>
               <w:spacing w:line="252" w:lineRule="auto"/>
             </w:pPr>
             <w:r>
@@ -6979,6 +7180,8 @@
           </w:tcPr>
           <w:p>
             <w:pPr>
+              <w:keepNext/>
+              <w:keepLines/>
               <w:spacing w:line="252" w:lineRule="auto"/>
             </w:pPr>
             <w:r>
@@ -7010,6 +7213,8 @@
           </w:tcPr>
           <w:p>
             <w:pPr>
+              <w:keepNext/>
+              <w:keepLines/>
               <w:spacing w:line="252" w:lineRule="auto"/>
             </w:pPr>
             <w:r>
@@ -7045,6 +7250,8 @@
           </w:tcPr>
           <w:p>
             <w:pPr>
+              <w:keepNext/>
+              <w:keepLines/>
               <w:spacing w:line="252" w:lineRule="auto"/>
             </w:pPr>
             <w:r>
@@ -7091,6 +7298,8 @@
           </w:tcPr>
           <w:p>
             <w:pPr>
+              <w:keepNext/>
+              <w:keepLines/>
               <w:spacing w:line="252" w:lineRule="auto"/>
             </w:pPr>
             <w:r>
@@ -7126,6 +7335,8 @@
           </w:tcPr>
           <w:p>
             <w:pPr>
+              <w:keepNext/>
+              <w:keepLines/>
               <w:spacing w:line="252" w:lineRule="auto"/>
             </w:pPr>
             <w:r>
@@ -7187,6 +7398,8 @@
           </w:tcPr>
           <w:p>
             <w:pPr>
+              <w:keepNext/>
+              <w:keepLines/>
               <w:spacing w:line="252" w:lineRule="auto"/>
             </w:pPr>
             <w:r>
@@ -7222,6 +7435,7 @@
           </w:tcPr>
           <w:p>
             <w:pPr>
+              <w:keepLines/>
               <w:spacing w:line="252" w:lineRule="auto"/>
             </w:pPr>
             <w:r>
@@ -7253,6 +7467,7 @@
           </w:tcPr>
           <w:p>
             <w:pPr>
+              <w:keepLines/>
               <w:spacing w:line="252" w:lineRule="auto"/>
             </w:pPr>
             <w:r>
@@ -7276,7 +7491,7 @@
         <w:pStyle w:val="Nadpis1"/>
         <w:spacing w:before="480"/>
       </w:pPr>
-      <w:bookmarkStart w:id="11" w:name="_Toc244086857"/>
+      <w:bookmarkStart w:id="11" w:name="_Toc244090143"/>
       <w:r>
         <w:t>6  Configuration (Config.toml)</w:t>
       </w:r>
@@ -7375,6 +7590,8 @@
           </w:tcPr>
           <w:p>
             <w:pPr>
+              <w:keepNext/>
+              <w:keepLines/>
               <w:spacing w:line="252" w:lineRule="auto"/>
             </w:pPr>
             <w:r>
@@ -7409,6 +7626,8 @@
           </w:tcPr>
           <w:p>
             <w:pPr>
+              <w:keepNext/>
+              <w:keepLines/>
               <w:spacing w:line="252" w:lineRule="auto"/>
             </w:pPr>
             <w:r>
@@ -7443,6 +7662,8 @@
           </w:tcPr>
           <w:p>
             <w:pPr>
+              <w:keepNext/>
+              <w:keepLines/>
               <w:spacing w:line="252" w:lineRule="auto"/>
             </w:pPr>
             <w:r>
@@ -7481,6 +7702,8 @@
           </w:tcPr>
           <w:p>
             <w:pPr>
+              <w:keepNext/>
+              <w:keepLines/>
               <w:spacing w:line="252" w:lineRule="auto"/>
             </w:pPr>
             <w:r>
@@ -7512,6 +7735,8 @@
           </w:tcPr>
           <w:p>
             <w:pPr>
+              <w:keepNext/>
+              <w:keepLines/>
               <w:spacing w:line="252" w:lineRule="auto"/>
             </w:pPr>
             <w:r>
@@ -7543,6 +7768,8 @@
           </w:tcPr>
           <w:p>
             <w:pPr>
+              <w:keepNext/>
+              <w:keepLines/>
               <w:spacing w:line="252" w:lineRule="auto"/>
             </w:pPr>
             <w:r>
@@ -7578,6 +7805,8 @@
           </w:tcPr>
           <w:p>
             <w:pPr>
+              <w:keepNext/>
+              <w:keepLines/>
               <w:spacing w:line="252" w:lineRule="auto"/>
             </w:pPr>
             <w:r>
@@ -7609,6 +7838,8 @@
           </w:tcPr>
           <w:p>
             <w:pPr>
+              <w:keepNext/>
+              <w:keepLines/>
               <w:spacing w:line="252" w:lineRule="auto"/>
             </w:pPr>
             <w:r>
@@ -7640,6 +7871,8 @@
           </w:tcPr>
           <w:p>
             <w:pPr>
+              <w:keepNext/>
+              <w:keepLines/>
               <w:spacing w:line="252" w:lineRule="auto"/>
             </w:pPr>
             <w:r>
@@ -7675,6 +7908,8 @@
           </w:tcPr>
           <w:p>
             <w:pPr>
+              <w:keepNext/>
+              <w:keepLines/>
               <w:spacing w:line="252" w:lineRule="auto"/>
             </w:pPr>
             <w:r>
@@ -7706,6 +7941,8 @@
           </w:tcPr>
           <w:p>
             <w:pPr>
+              <w:keepNext/>
+              <w:keepLines/>
               <w:spacing w:line="252" w:lineRule="auto"/>
             </w:pPr>
             <w:r>
@@ -7737,6 +7974,8 @@
           </w:tcPr>
           <w:p>
             <w:pPr>
+              <w:keepNext/>
+              <w:keepLines/>
               <w:spacing w:line="252" w:lineRule="auto"/>
             </w:pPr>
             <w:r>
@@ -7787,6 +8026,8 @@
           </w:tcPr>
           <w:p>
             <w:pPr>
+              <w:keepNext/>
+              <w:keepLines/>
               <w:spacing w:line="252" w:lineRule="auto"/>
             </w:pPr>
             <w:r>
@@ -7818,6 +8059,8 @@
           </w:tcPr>
           <w:p>
             <w:pPr>
+              <w:keepNext/>
+              <w:keepLines/>
               <w:spacing w:line="252" w:lineRule="auto"/>
             </w:pPr>
             <w:r>
@@ -7849,6 +8092,8 @@
           </w:tcPr>
           <w:p>
             <w:pPr>
+              <w:keepNext/>
+              <w:keepLines/>
               <w:spacing w:line="252" w:lineRule="auto"/>
             </w:pPr>
             <w:r>
@@ -7884,6 +8129,8 @@
           </w:tcPr>
           <w:p>
             <w:pPr>
+              <w:keepNext/>
+              <w:keepLines/>
               <w:spacing w:line="252" w:lineRule="auto"/>
             </w:pPr>
             <w:r>
@@ -7930,6 +8177,8 @@
           </w:tcPr>
           <w:p>
             <w:pPr>
+              <w:keepNext/>
+              <w:keepLines/>
               <w:spacing w:line="252" w:lineRule="auto"/>
             </w:pPr>
             <w:r>
@@ -7976,6 +8225,8 @@
           </w:tcPr>
           <w:p>
             <w:pPr>
+              <w:keepNext/>
+              <w:keepLines/>
               <w:spacing w:line="252" w:lineRule="auto"/>
             </w:pPr>
             <w:r>
@@ -8011,6 +8262,8 @@
           </w:tcPr>
           <w:p>
             <w:pPr>
+              <w:keepNext/>
+              <w:keepLines/>
               <w:spacing w:line="252" w:lineRule="auto"/>
             </w:pPr>
             <w:r>
@@ -8042,6 +8295,8 @@
           </w:tcPr>
           <w:p>
             <w:pPr>
+              <w:keepNext/>
+              <w:keepLines/>
               <w:spacing w:line="252" w:lineRule="auto"/>
             </w:pPr>
             <w:r>
@@ -8073,6 +8328,8 @@
           </w:tcPr>
           <w:p>
             <w:pPr>
+              <w:keepNext/>
+              <w:keepLines/>
               <w:spacing w:line="252" w:lineRule="auto"/>
             </w:pPr>
             <w:r>
@@ -8123,6 +8380,8 @@
           </w:tcPr>
           <w:p>
             <w:pPr>
+              <w:keepNext/>
+              <w:keepLines/>
               <w:spacing w:line="252" w:lineRule="auto"/>
             </w:pPr>
             <w:r>
@@ -8154,6 +8413,8 @@
           </w:tcPr>
           <w:p>
             <w:pPr>
+              <w:keepNext/>
+              <w:keepLines/>
               <w:spacing w:line="252" w:lineRule="auto"/>
             </w:pPr>
             <w:r>
@@ -8185,6 +8446,8 @@
           </w:tcPr>
           <w:p>
             <w:pPr>
+              <w:keepNext/>
+              <w:keepLines/>
               <w:spacing w:line="252" w:lineRule="auto"/>
             </w:pPr>
             <w:r>
@@ -8250,6 +8513,8 @@
           </w:tcPr>
           <w:p>
             <w:pPr>
+              <w:keepNext/>
+              <w:keepLines/>
               <w:spacing w:line="252" w:lineRule="auto"/>
             </w:pPr>
             <w:r>
@@ -8296,6 +8561,8 @@
           </w:tcPr>
           <w:p>
             <w:pPr>
+              <w:keepNext/>
+              <w:keepLines/>
               <w:spacing w:line="252" w:lineRule="auto"/>
             </w:pPr>
             <w:r>
@@ -8342,6 +8609,8 @@
           </w:tcPr>
           <w:p>
             <w:pPr>
+              <w:keepNext/>
+              <w:keepLines/>
               <w:spacing w:line="252" w:lineRule="auto"/>
             </w:pPr>
             <w:r>
@@ -8377,6 +8646,8 @@
           </w:tcPr>
           <w:p>
             <w:pPr>
+              <w:keepNext/>
+              <w:keepLines/>
               <w:spacing w:line="252" w:lineRule="auto"/>
             </w:pPr>
             <w:r>
@@ -8408,6 +8679,8 @@
           </w:tcPr>
           <w:p>
             <w:pPr>
+              <w:keepNext/>
+              <w:keepLines/>
               <w:spacing w:line="252" w:lineRule="auto"/>
             </w:pPr>
             <w:r>
@@ -8439,6 +8712,8 @@
           </w:tcPr>
           <w:p>
             <w:pPr>
+              <w:keepNext/>
+              <w:keepLines/>
               <w:spacing w:line="252" w:lineRule="auto"/>
             </w:pPr>
             <w:r>
@@ -8474,6 +8749,7 @@
           </w:tcPr>
           <w:p>
             <w:pPr>
+              <w:keepLines/>
               <w:spacing w:line="252" w:lineRule="auto"/>
             </w:pPr>
             <w:r>
@@ -8520,6 +8796,7 @@
           </w:tcPr>
           <w:p>
             <w:pPr>
+              <w:keepLines/>
               <w:spacing w:line="252" w:lineRule="auto"/>
             </w:pPr>
             <w:r>
@@ -8551,6 +8828,7 @@
           </w:tcPr>
           <w:p>
             <w:pPr>
+              <w:keepLines/>
               <w:spacing w:line="252" w:lineRule="auto"/>
             </w:pPr>
             <w:r>
@@ -8677,7 +8955,7 @@
         <w:pStyle w:val="Nadpis1"/>
         <w:spacing w:before="480"/>
       </w:pPr>
-      <w:bookmarkStart w:id="12" w:name="_Toc244086858"/>
+      <w:bookmarkStart w:id="12" w:name="_Toc244090144"/>
       <w:r>
         <w:t>7  Installation and update</w:t>
       </w:r>
@@ -8687,7 +8965,7 @@
       <w:pPr>
         <w:pStyle w:val="Nadpis2"/>
       </w:pPr>
-      <w:bookmarkStart w:id="13" w:name="_Toc244086859"/>
+      <w:bookmarkStart w:id="13" w:name="_Toc244090145"/>
       <w:r>
         <w:t>7.1  Package contents</w:t>
       </w:r>
@@ -8758,6 +9036,8 @@
           </w:tcPr>
           <w:p>
             <w:pPr>
+              <w:keepNext/>
+              <w:keepLines/>
               <w:spacing w:line="252" w:lineRule="auto"/>
             </w:pPr>
             <w:r>
@@ -8792,6 +9072,8 @@
           </w:tcPr>
           <w:p>
             <w:pPr>
+              <w:keepNext/>
+              <w:keepLines/>
               <w:spacing w:line="252" w:lineRule="auto"/>
             </w:pPr>
             <w:r>
@@ -8830,6 +9112,8 @@
           </w:tcPr>
           <w:p>
             <w:pPr>
+              <w:keepNext/>
+              <w:keepLines/>
               <w:spacing w:line="252" w:lineRule="auto"/>
             </w:pPr>
             <w:r>
@@ -8861,6 +9145,8 @@
           </w:tcPr>
           <w:p>
             <w:pPr>
+              <w:keepNext/>
+              <w:keepLines/>
               <w:spacing w:line="252" w:lineRule="auto"/>
             </w:pPr>
             <w:r>
@@ -8904,6 +9190,8 @@
           </w:tcPr>
           <w:p>
             <w:pPr>
+              <w:keepNext/>
+              <w:keepLines/>
               <w:spacing w:line="252" w:lineRule="auto"/>
             </w:pPr>
             <w:r>
@@ -8935,6 +9223,8 @@
           </w:tcPr>
           <w:p>
             <w:pPr>
+              <w:keepNext/>
+              <w:keepLines/>
               <w:spacing w:line="252" w:lineRule="auto"/>
             </w:pPr>
             <w:r>
@@ -8970,6 +9260,8 @@
           </w:tcPr>
           <w:p>
             <w:pPr>
+              <w:keepNext/>
+              <w:keepLines/>
               <w:spacing w:line="252" w:lineRule="auto"/>
             </w:pPr>
             <w:r>
@@ -9001,6 +9293,8 @@
           </w:tcPr>
           <w:p>
             <w:pPr>
+              <w:keepNext/>
+              <w:keepLines/>
               <w:spacing w:line="252" w:lineRule="auto"/>
             </w:pPr>
             <w:r>
@@ -9051,6 +9345,8 @@
           </w:tcPr>
           <w:p>
             <w:pPr>
+              <w:keepNext/>
+              <w:keepLines/>
               <w:spacing w:line="252" w:lineRule="auto"/>
             </w:pPr>
             <w:r>
@@ -9082,6 +9378,8 @@
           </w:tcPr>
           <w:p>
             <w:pPr>
+              <w:keepNext/>
+              <w:keepLines/>
               <w:spacing w:line="252" w:lineRule="auto"/>
             </w:pPr>
             <w:r>
@@ -9117,6 +9415,8 @@
           </w:tcPr>
           <w:p>
             <w:pPr>
+              <w:keepNext/>
+              <w:keepLines/>
               <w:spacing w:line="252" w:lineRule="auto"/>
             </w:pPr>
             <w:r>
@@ -9178,6 +9478,8 @@
           </w:tcPr>
           <w:p>
             <w:pPr>
+              <w:keepNext/>
+              <w:keepLines/>
               <w:spacing w:line="252" w:lineRule="auto"/>
             </w:pPr>
             <w:r>
@@ -9213,6 +9515,7 @@
           </w:tcPr>
           <w:p>
             <w:pPr>
+              <w:keepLines/>
               <w:spacing w:line="252" w:lineRule="auto"/>
             </w:pPr>
             <w:r>
@@ -9244,6 +9547,7 @@
           </w:tcPr>
           <w:p>
             <w:pPr>
+              <w:keepLines/>
               <w:spacing w:line="252" w:lineRule="auto"/>
             </w:pPr>
             <w:r>
@@ -9266,7 +9570,7 @@
       <w:pPr>
         <w:pStyle w:val="Nadpis2"/>
       </w:pPr>
-      <w:bookmarkStart w:id="14" w:name="_Toc244086860"/>
+      <w:bookmarkStart w:id="14" w:name="_Toc244090146"/>
       <w:r>
         <w:t>7.2  First installation</w:t>
       </w:r>
@@ -9492,7 +9796,7 @@
       <w:pPr>
         <w:pStyle w:val="Nadpis2"/>
       </w:pPr>
-      <w:bookmarkStart w:id="15" w:name="_Toc244086861"/>
+      <w:bookmarkStart w:id="15" w:name="_Toc244090147"/>
       <w:r>
         <w:t>7.3  Update on the tester PC</w:t>
       </w:r>
@@ -9598,7 +9902,7 @@
       <w:pPr>
         <w:pStyle w:val="Nadpis2"/>
       </w:pPr>
-      <w:bookmarkStart w:id="16" w:name="_Toc244086862"/>
+      <w:bookmarkStart w:id="16" w:name="_Toc244090148"/>
       <w:r>
         <w:t>7.4  Stopping and uninstallation</w:t>
       </w:r>
@@ -9639,7 +9943,7 @@
         <w:pStyle w:val="Nadpis1"/>
         <w:spacing w:before="480"/>
       </w:pPr>
-      <w:bookmarkStart w:id="17" w:name="_Toc244086863"/>
+      <w:bookmarkStart w:id="17" w:name="_Toc244090149"/>
       <w:r>
         <w:t>8  Operation and diagnostics</w:t>
       </w:r>
@@ -9649,7 +9953,7 @@
       <w:pPr>
         <w:pStyle w:val="Nadpis2"/>
       </w:pPr>
-      <w:bookmarkStart w:id="18" w:name="_Toc244086864"/>
+      <w:bookmarkStart w:id="18" w:name="_Toc244090150"/>
       <w:r>
         <w:t>8.1  How to check the state</w:t>
       </w:r>
@@ -9657,6 +9961,7 @@
     </w:p>
     <w:p>
       <w:pPr>
+        <w:keepNext/>
         <w:spacing w:after="120" w:line="288" w:lineRule="auto"/>
       </w:pPr>
       <w:r>
@@ -9736,6 +10041,8 @@
           </w:tcPr>
           <w:p>
             <w:pPr>
+              <w:keepNext/>
+              <w:keepLines/>
               <w:spacing w:line="252" w:lineRule="auto"/>
             </w:pPr>
             <w:r>
@@ -9770,6 +10077,8 @@
           </w:tcPr>
           <w:p>
             <w:pPr>
+              <w:keepNext/>
+              <w:keepLines/>
               <w:spacing w:line="252" w:lineRule="auto"/>
             </w:pPr>
             <w:r>
@@ -9808,6 +10117,8 @@
           </w:tcPr>
           <w:p>
             <w:pPr>
+              <w:keepNext/>
+              <w:keepLines/>
               <w:spacing w:line="252" w:lineRule="auto"/>
             </w:pPr>
             <w:r>
@@ -9839,6 +10150,8 @@
           </w:tcPr>
           <w:p>
             <w:pPr>
+              <w:keepNext/>
+              <w:keepLines/>
               <w:spacing w:line="252" w:lineRule="auto"/>
             </w:pPr>
             <w:r>
@@ -9912,6 +10225,8 @@
           </w:tcPr>
           <w:p>
             <w:pPr>
+              <w:keepNext/>
+              <w:keepLines/>
               <w:spacing w:line="252" w:lineRule="auto"/>
             </w:pPr>
             <w:r>
@@ -9943,6 +10258,8 @@
           </w:tcPr>
           <w:p>
             <w:pPr>
+              <w:keepNext/>
+              <w:keepLines/>
               <w:spacing w:line="252" w:lineRule="auto"/>
             </w:pPr>
             <w:r>
@@ -9978,6 +10295,8 @@
           </w:tcPr>
           <w:p>
             <w:pPr>
+              <w:keepNext/>
+              <w:keepLines/>
               <w:spacing w:line="252" w:lineRule="auto"/>
             </w:pPr>
             <w:r>
@@ -10009,6 +10328,8 @@
           </w:tcPr>
           <w:p>
             <w:pPr>
+              <w:keepNext/>
+              <w:keepLines/>
               <w:spacing w:line="252" w:lineRule="auto"/>
             </w:pPr>
             <w:r>
@@ -10044,6 +10365,8 @@
           </w:tcPr>
           <w:p>
             <w:pPr>
+              <w:keepNext/>
+              <w:keepLines/>
               <w:spacing w:line="252" w:lineRule="auto"/>
             </w:pPr>
             <w:r>
@@ -10075,6 +10398,8 @@
           </w:tcPr>
           <w:p>
             <w:pPr>
+              <w:keepNext/>
+              <w:keepLines/>
               <w:spacing w:line="252" w:lineRule="auto"/>
             </w:pPr>
             <w:r>
@@ -10110,6 +10435,7 @@
           </w:tcPr>
           <w:p>
             <w:pPr>
+              <w:keepLines/>
               <w:spacing w:line="252" w:lineRule="auto"/>
             </w:pPr>
             <w:r>
@@ -10141,6 +10467,7 @@
           </w:tcPr>
           <w:p>
             <w:pPr>
+              <w:keepLines/>
               <w:spacing w:line="252" w:lineRule="auto"/>
             </w:pPr>
             <w:r>
@@ -10171,7 +10498,7 @@
       <w:pPr>
         <w:pStyle w:val="Nadpis2"/>
       </w:pPr>
-      <w:bookmarkStart w:id="19" w:name="_Toc244086865"/>
+      <w:bookmarkStart w:id="19" w:name="_Toc244090151"/>
       <w:r>
         <w:t>8.2  Logs</w:t>
       </w:r>
@@ -10381,7 +10708,7 @@
       <w:pPr>
         <w:pStyle w:val="Nadpis2"/>
       </w:pPr>
-      <w:bookmarkStart w:id="20" w:name="_Toc244086866"/>
+      <w:bookmarkStart w:id="20" w:name="_Toc244090152"/>
       <w:r>
         <w:t>8.3  Cache and memory</w:t>
       </w:r>
@@ -10461,7 +10788,7 @@
         <w:pStyle w:val="Nadpis1"/>
         <w:spacing w:before="480"/>
       </w:pPr>
-      <w:bookmarkStart w:id="21" w:name="_Toc244086867"/>
+      <w:bookmarkStart w:id="21" w:name="_Toc244090153"/>
       <w:r>
         <w:t>9  Troubleshooting</w:t>
       </w:r>
@@ -10533,6 +10860,8 @@
           </w:tcPr>
           <w:p>
             <w:pPr>
+              <w:keepNext/>
+              <w:keepLines/>
               <w:spacing w:line="252" w:lineRule="auto"/>
             </w:pPr>
             <w:r>
@@ -10567,6 +10896,8 @@
           </w:tcPr>
           <w:p>
             <w:pPr>
+              <w:keepNext/>
+              <w:keepLines/>
               <w:spacing w:line="252" w:lineRule="auto"/>
             </w:pPr>
             <w:r>
@@ -10601,6 +10932,8 @@
           </w:tcPr>
           <w:p>
             <w:pPr>
+              <w:keepNext/>
+              <w:keepLines/>
               <w:spacing w:line="252" w:lineRule="auto"/>
             </w:pPr>
             <w:r>
@@ -10639,6 +10972,8 @@
           </w:tcPr>
           <w:p>
             <w:pPr>
+              <w:keepNext/>
+              <w:keepLines/>
               <w:spacing w:line="252" w:lineRule="auto"/>
             </w:pPr>
             <w:r>
@@ -10669,6 +11004,8 @@
           </w:tcPr>
           <w:p>
             <w:pPr>
+              <w:keepNext/>
+              <w:keepLines/>
               <w:spacing w:line="252" w:lineRule="auto"/>
             </w:pPr>
             <w:r>
@@ -10759,6 +11096,8 @@
           </w:tcPr>
           <w:p>
             <w:pPr>
+              <w:keepNext/>
+              <w:keepLines/>
               <w:spacing w:line="252" w:lineRule="auto"/>
             </w:pPr>
             <w:r>
@@ -10810,6 +11149,8 @@
           </w:tcPr>
           <w:p>
             <w:pPr>
+              <w:keepNext/>
+              <w:keepLines/>
               <w:spacing w:line="252" w:lineRule="auto"/>
             </w:pPr>
             <w:r>
@@ -10840,6 +11181,8 @@
           </w:tcPr>
           <w:p>
             <w:pPr>
+              <w:keepNext/>
+              <w:keepLines/>
               <w:spacing w:line="252" w:lineRule="auto"/>
             </w:pPr>
             <w:r>
@@ -10885,6 +11228,8 @@
           </w:tcPr>
           <w:p>
             <w:pPr>
+              <w:keepNext/>
+              <w:keepLines/>
               <w:spacing w:line="252" w:lineRule="auto"/>
             </w:pPr>
             <w:r>
@@ -10928,6 +11273,8 @@
           </w:tcPr>
           <w:p>
             <w:pPr>
+              <w:keepNext/>
+              <w:keepLines/>
               <w:spacing w:line="252" w:lineRule="auto"/>
             </w:pPr>
             <w:r>
@@ -10958,6 +11305,8 @@
           </w:tcPr>
           <w:p>
             <w:pPr>
+              <w:keepNext/>
+              <w:keepLines/>
               <w:spacing w:line="252" w:lineRule="auto"/>
             </w:pPr>
             <w:r>
@@ -11018,6 +11367,8 @@
           </w:tcPr>
           <w:p>
             <w:pPr>
+              <w:keepNext/>
+              <w:keepLines/>
               <w:spacing w:line="252" w:lineRule="auto"/>
             </w:pPr>
             <w:r>
@@ -11054,6 +11405,8 @@
           </w:tcPr>
           <w:p>
             <w:pPr>
+              <w:keepNext/>
+              <w:keepLines/>
               <w:spacing w:line="252" w:lineRule="auto"/>
             </w:pPr>
             <w:r>
@@ -11084,6 +11437,8 @@
           </w:tcPr>
           <w:p>
             <w:pPr>
+              <w:keepNext/>
+              <w:keepLines/>
               <w:spacing w:line="252" w:lineRule="auto"/>
             </w:pPr>
             <w:r>
@@ -11145,6 +11500,8 @@
           </w:tcPr>
           <w:p>
             <w:pPr>
+              <w:keepNext/>
+              <w:keepLines/>
               <w:spacing w:line="252" w:lineRule="auto"/>
             </w:pPr>
             <w:r>
@@ -11180,6 +11537,8 @@
           </w:tcPr>
           <w:p>
             <w:pPr>
+              <w:keepNext/>
+              <w:keepLines/>
               <w:spacing w:line="252" w:lineRule="auto"/>
             </w:pPr>
             <w:r>
@@ -11210,6 +11569,8 @@
           </w:tcPr>
           <w:p>
             <w:pPr>
+              <w:keepNext/>
+              <w:keepLines/>
               <w:spacing w:line="252" w:lineRule="auto"/>
             </w:pPr>
             <w:r>
@@ -11240,6 +11601,8 @@
           </w:tcPr>
           <w:p>
             <w:pPr>
+              <w:keepNext/>
+              <w:keepLines/>
               <w:spacing w:line="252" w:lineRule="auto"/>
             </w:pPr>
             <w:r>
@@ -11290,6 +11653,8 @@
           </w:tcPr>
           <w:p>
             <w:pPr>
+              <w:keepNext/>
+              <w:keepLines/>
               <w:spacing w:line="252" w:lineRule="auto"/>
             </w:pPr>
             <w:r>
@@ -11320,6 +11685,8 @@
           </w:tcPr>
           <w:p>
             <w:pPr>
+              <w:keepNext/>
+              <w:keepLines/>
               <w:spacing w:line="252" w:lineRule="auto"/>
             </w:pPr>
             <w:r>
@@ -11350,6 +11717,8 @@
           </w:tcPr>
           <w:p>
             <w:pPr>
+              <w:keepNext/>
+              <w:keepLines/>
               <w:spacing w:line="252" w:lineRule="auto"/>
             </w:pPr>
             <w:r>
@@ -11385,6 +11754,8 @@
           </w:tcPr>
           <w:p>
             <w:pPr>
+              <w:keepNext/>
+              <w:keepLines/>
               <w:spacing w:line="252" w:lineRule="auto"/>
             </w:pPr>
             <w:r>
@@ -11415,6 +11786,8 @@
           </w:tcPr>
           <w:p>
             <w:pPr>
+              <w:keepNext/>
+              <w:keepLines/>
               <w:spacing w:line="252" w:lineRule="auto"/>
             </w:pPr>
             <w:r>
@@ -11453,6 +11826,8 @@
           </w:tcPr>
           <w:p>
             <w:pPr>
+              <w:keepNext/>
+              <w:keepLines/>
               <w:spacing w:line="252" w:lineRule="auto"/>
             </w:pPr>
             <w:r>
@@ -11489,6 +11864,8 @@
           </w:tcPr>
           <w:p>
             <w:pPr>
+              <w:keepNext/>
+              <w:keepLines/>
               <w:spacing w:line="252" w:lineRule="auto"/>
             </w:pPr>
             <w:r>
@@ -11519,6 +11896,8 @@
           </w:tcPr>
           <w:p>
             <w:pPr>
+              <w:keepNext/>
+              <w:keepLines/>
               <w:spacing w:line="252" w:lineRule="auto"/>
             </w:pPr>
             <w:r>
@@ -11557,6 +11936,8 @@
           </w:tcPr>
           <w:p>
             <w:pPr>
+              <w:keepNext/>
+              <w:keepLines/>
               <w:spacing w:line="252" w:lineRule="auto"/>
             </w:pPr>
             <w:r>
@@ -11600,6 +11981,7 @@
           </w:tcPr>
           <w:p>
             <w:pPr>
+              <w:keepLines/>
               <w:spacing w:line="252" w:lineRule="auto"/>
             </w:pPr>
             <w:r>
@@ -11630,6 +12012,7 @@
           </w:tcPr>
           <w:p>
             <w:pPr>
+              <w:keepLines/>
               <w:spacing w:line="252" w:lineRule="auto"/>
             </w:pPr>
             <w:r>
@@ -11660,6 +12043,7 @@
           </w:tcPr>
           <w:p>
             <w:pPr>
+              <w:keepLines/>
               <w:spacing w:line="252" w:lineRule="auto"/>
             </w:pPr>
             <w:r>
@@ -11728,7 +12112,7 @@
         <w:pStyle w:val="Nadpis1"/>
         <w:spacing w:before="480"/>
       </w:pPr>
-      <w:bookmarkStart w:id="22" w:name="_Toc244086868"/>
+      <w:bookmarkStart w:id="22" w:name="_Toc244090154"/>
       <w:r>
         <w:t>Appendix A  Terms and abbreviations</w:t>
       </w:r>
@@ -11799,6 +12183,8 @@
           </w:tcPr>
           <w:p>
             <w:pPr>
+              <w:keepNext/>
+              <w:keepLines/>
               <w:spacing w:line="252" w:lineRule="auto"/>
             </w:pPr>
             <w:r>
@@ -11833,6 +12219,8 @@
           </w:tcPr>
           <w:p>
             <w:pPr>
+              <w:keepNext/>
+              <w:keepLines/>
               <w:spacing w:line="252" w:lineRule="auto"/>
             </w:pPr>
             <w:r>
@@ -11871,6 +12259,8 @@
           </w:tcPr>
           <w:p>
             <w:pPr>
+              <w:keepNext/>
+              <w:keepLines/>
               <w:spacing w:line="252" w:lineRule="auto"/>
             </w:pPr>
             <w:r>
@@ -11901,6 +12291,8 @@
           </w:tcPr>
           <w:p>
             <w:pPr>
+              <w:keepNext/>
+              <w:keepLines/>
               <w:spacing w:line="252" w:lineRule="auto"/>
             </w:pPr>
             <w:r>
@@ -11936,6 +12328,8 @@
           </w:tcPr>
           <w:p>
             <w:pPr>
+              <w:keepNext/>
+              <w:keepLines/>
               <w:spacing w:line="252" w:lineRule="auto"/>
             </w:pPr>
             <w:r>
@@ -11966,6 +12360,8 @@
           </w:tcPr>
           <w:p>
             <w:pPr>
+              <w:keepNext/>
+              <w:keepLines/>
               <w:spacing w:line="252" w:lineRule="auto"/>
             </w:pPr>
             <w:r>
@@ -12001,6 +12397,8 @@
           </w:tcPr>
           <w:p>
             <w:pPr>
+              <w:keepNext/>
+              <w:keepLines/>
               <w:spacing w:line="252" w:lineRule="auto"/>
             </w:pPr>
             <w:r>
@@ -12031,6 +12429,8 @@
           </w:tcPr>
           <w:p>
             <w:pPr>
+              <w:keepNext/>
+              <w:keepLines/>
               <w:spacing w:line="252" w:lineRule="auto"/>
             </w:pPr>
             <w:r>
@@ -12066,6 +12466,8 @@
           </w:tcPr>
           <w:p>
             <w:pPr>
+              <w:keepNext/>
+              <w:keepLines/>
               <w:spacing w:line="252" w:lineRule="auto"/>
             </w:pPr>
             <w:r>
@@ -12096,6 +12498,8 @@
           </w:tcPr>
           <w:p>
             <w:pPr>
+              <w:keepNext/>
+              <w:keepLines/>
               <w:spacing w:line="252" w:lineRule="auto"/>
             </w:pPr>
             <w:r>
@@ -12146,6 +12550,8 @@
           </w:tcPr>
           <w:p>
             <w:pPr>
+              <w:keepNext/>
+              <w:keepLines/>
               <w:spacing w:line="252" w:lineRule="auto"/>
             </w:pPr>
             <w:r>
@@ -12176,6 +12582,8 @@
           </w:tcPr>
           <w:p>
             <w:pPr>
+              <w:keepNext/>
+              <w:keepLines/>
               <w:spacing w:line="252" w:lineRule="auto"/>
             </w:pPr>
             <w:r>
@@ -12211,6 +12619,8 @@
           </w:tcPr>
           <w:p>
             <w:pPr>
+              <w:keepNext/>
+              <w:keepLines/>
               <w:spacing w:line="252" w:lineRule="auto"/>
             </w:pPr>
             <w:r>
@@ -12241,6 +12651,8 @@
           </w:tcPr>
           <w:p>
             <w:pPr>
+              <w:keepNext/>
+              <w:keepLines/>
               <w:spacing w:line="252" w:lineRule="auto"/>
             </w:pPr>
             <w:r>
@@ -12276,6 +12688,7 @@
           </w:tcPr>
           <w:p>
             <w:pPr>
+              <w:keepLines/>
               <w:spacing w:line="252" w:lineRule="auto"/>
             </w:pPr>
             <w:r>
@@ -12306,6 +12719,7 @@
           </w:tcPr>
           <w:p>
             <w:pPr>
+              <w:keepLines/>
               <w:spacing w:line="252" w:lineRule="auto"/>
             </w:pPr>
             <w:r>
@@ -12527,10 +12941,64 @@
 <file path=word/numbering.xml><?xml version="1.0" encoding="utf-8"?>
 <w:numbering xmlns:wpc="http://schemas.microsoft.com/office/word/2010/wordprocessingCanvas" xmlns:cx="http://schemas.microsoft.com/office/drawing/2014/chartex" xmlns:cx1="http://schemas.microsoft.com/office/drawing/2015/9/8/chartex" xmlns:cx2="http://schemas.microsoft.com/office/drawing/2015/10/21/chartex" xmlns:cx3="http://schemas.microsoft.com/office/drawing/2016/5/9/chartex" xmlns:cx4="http://schemas.microsoft.com/office/drawing/2016/5/10/chartex" xmlns:cx5="http://schemas.microsoft.com/office/drawing/2016/5/11/chartex" xmlns:cx6="http://schemas.microsoft.com/office/drawing/2016/5/12/chartex" xmlns:cx7="http://schemas.microsoft.com/office/drawing/2016/5/13/chartex" xmlns:cx8="http://schemas.microsoft.com/office/drawing/2016/5/14/chartex" xmlns:mc="http://schemas.openxmlformats.org/markup-compatibility/2006" xmlns:aink="http://schemas.microsoft.com/office/drawing/2016/ink" xmlns:am3d="http://schemas.microsoft.com/office/drawing/2017/model3d" xmlns:o="urn:schemas-microsoft-com:office:office" xmlns:oel="http://schemas.microsoft.com/office/2019/extlst" xmlns:r="http://schemas.openxmlformats.org/officeDocument/2006/relationships" xmlns:m="http://schemas.openxmlformats.org/officeDocument/2006/math" xmlns:v="urn:schemas-microsoft-com:vml" xmlns:wp14="http://schemas.microsoft.com/office/word/2010/wordprocessingDrawing" xmlns:wp="http://schemas.openxmlformats.org/drawingml/2006/wordprocessingDrawing" xmlns:w10="urn:schemas-microsoft-com:office:word" xmlns:w="http://schemas.openxmlformats.org/wordprocessingml/2006/main" xmlns:w14="http://schemas.microsoft.com/office/word/2010/wordml" xmlns:w15="http://schemas.microsoft.com/office/word/2012/wordml" xmlns:w16cex="http://schemas.microsoft.com/office/word/2018/wordml/cex" xmlns:w16cid="http://schemas.microsoft.com/office/word/2016/wordml/cid" xmlns:w16="http://schemas.microsoft.com/office/word/2018/wordml" xmlns:w16du="http://schemas.microsoft.com/office/word/2023/wordml/word16du" xmlns:w16sdtdh="http://schemas.microsoft.com/office/word/2020/wordml/sdtdatahash" xmlns:w16sdtfl="http://schemas.microsoft.com/office/word/2024/wordml/sdtformatlock" xmlns:w16se="http://schemas.microsoft.com/office/word/2015/wordml/symex" xmlns:wpg="http://schemas.microsoft.com/office/word/2010/wordprocessingGroup" xmlns:wpi="http://schemas.microsoft.com/office/word/2010/wordprocessingInk" xmlns:wne="http://schemas.microsoft.com/office/word/2006/wordml" xmlns:wps="http://schemas.microsoft.com/office/word/2010/wordprocessingShape" mc:Ignorable="w14 w15 w16se w16cid w16 w16cex w16sdtdh w16sdtfl w16du wp14">
   <w:abstractNum w:abstractNumId="0" w15:restartNumberingAfterBreak="0">
-    <w:nsid w:val="1DD10E66"/>
+    <w:nsid w:val="4E9321F1"/>
     <w:multiLevelType w:val="hybridMultilevel"/>
-    <w:tmpl w:val="0A56CA1A"/>
-    <w:lvl w:ilvl="0" w:tplc="C19887C8">
+    <w:tmpl w:val="B1685172"/>
+    <w:lvl w:ilvl="0" w:tplc="EC064B34">
+      <w:start w:val="1"/>
+      <w:numFmt w:val="decimal"/>
+      <w:lvlText w:val="%1."/>
+      <w:lvlJc w:val="left"/>
+      <w:pPr>
+        <w:ind w:left="540" w:hanging="300"/>
+      </w:pPr>
+    </w:lvl>
+    <w:lvl w:ilvl="1" w:tplc="5FDE247E">
+      <w:numFmt w:val="decimal"/>
+      <w:lvlText w:val=""/>
+      <w:lvlJc w:val="left"/>
+    </w:lvl>
+    <w:lvl w:ilvl="2" w:tplc="39B68E7C">
+      <w:numFmt w:val="decimal"/>
+      <w:lvlText w:val=""/>
+      <w:lvlJc w:val="left"/>
+    </w:lvl>
+    <w:lvl w:ilvl="3" w:tplc="AFF0FC60">
+      <w:numFmt w:val="decimal"/>
+      <w:lvlText w:val=""/>
+      <w:lvlJc w:val="left"/>
+    </w:lvl>
+    <w:lvl w:ilvl="4" w:tplc="9F98017E">
+      <w:numFmt w:val="decimal"/>
+      <w:lvlText w:val=""/>
+      <w:lvlJc w:val="left"/>
+    </w:lvl>
+    <w:lvl w:ilvl="5" w:tplc="939AF784">
+      <w:numFmt w:val="decimal"/>
+      <w:lvlText w:val=""/>
+      <w:lvlJc w:val="left"/>
+    </w:lvl>
+    <w:lvl w:ilvl="6" w:tplc="30F6A87C">
+      <w:numFmt w:val="decimal"/>
+      <w:lvlText w:val=""/>
+      <w:lvlJc w:val="left"/>
+    </w:lvl>
+    <w:lvl w:ilvl="7" w:tplc="092E9042">
+      <w:numFmt w:val="decimal"/>
+      <w:lvlText w:val=""/>
+      <w:lvlJc w:val="left"/>
+    </w:lvl>
+    <w:lvl w:ilvl="8" w:tplc="C366C5E4">
+      <w:numFmt w:val="decimal"/>
+      <w:lvlText w:val=""/>
+      <w:lvlJc w:val="left"/>
+    </w:lvl>
+  </w:abstractNum>
+  <w:abstractNum w:abstractNumId="1" w15:restartNumberingAfterBreak="0">
+    <w:nsid w:val="534B24CD"/>
+    <w:multiLevelType w:val="hybridMultilevel"/>
+    <w:tmpl w:val="1406928A"/>
+    <w:lvl w:ilvl="0" w:tplc="219A80EC">
       <w:start w:val="1"/>
       <w:numFmt w:val="bullet"/>
       <w:lvlText w:val="•"/>
@@ -12539,52 +13007,52 @@
         <w:ind w:left="540" w:hanging="270"/>
       </w:pPr>
     </w:lvl>
-    <w:lvl w:ilvl="1" w:tplc="8E9EDBF4">
+    <w:lvl w:ilvl="1" w:tplc="4510E328">
       <w:numFmt w:val="decimal"/>
       <w:lvlText w:val=""/>
       <w:lvlJc w:val="left"/>
     </w:lvl>
-    <w:lvl w:ilvl="2" w:tplc="DCE62600">
+    <w:lvl w:ilvl="2" w:tplc="16BC9966">
       <w:numFmt w:val="decimal"/>
       <w:lvlText w:val=""/>
       <w:lvlJc w:val="left"/>
     </w:lvl>
-    <w:lvl w:ilvl="3" w:tplc="33082BA8">
+    <w:lvl w:ilvl="3" w:tplc="5A0CFBB4">
       <w:numFmt w:val="decimal"/>
       <w:lvlText w:val=""/>
       <w:lvlJc w:val="left"/>
     </w:lvl>
-    <w:lvl w:ilvl="4" w:tplc="3926C540">
+    <w:lvl w:ilvl="4" w:tplc="DB9EBB20">
       <w:numFmt w:val="decimal"/>
       <w:lvlText w:val=""/>
       <w:lvlJc w:val="left"/>
     </w:lvl>
-    <w:lvl w:ilvl="5" w:tplc="D1227DE2">
+    <w:lvl w:ilvl="5" w:tplc="68AE62CC">
       <w:numFmt w:val="decimal"/>
       <w:lvlText w:val=""/>
       <w:lvlJc w:val="left"/>
     </w:lvl>
-    <w:lvl w:ilvl="6" w:tplc="BA341782">
+    <w:lvl w:ilvl="6" w:tplc="C9986498">
       <w:numFmt w:val="decimal"/>
       <w:lvlText w:val=""/>
       <w:lvlJc w:val="left"/>
     </w:lvl>
-    <w:lvl w:ilvl="7" w:tplc="4A7E5A4A">
+    <w:lvl w:ilvl="7" w:tplc="7BFABA84">
       <w:numFmt w:val="decimal"/>
       <w:lvlText w:val=""/>
       <w:lvlJc w:val="left"/>
     </w:lvl>
-    <w:lvl w:ilvl="8" w:tplc="5AFAB7EC">
+    <w:lvl w:ilvl="8" w:tplc="0700D144">
       <w:numFmt w:val="decimal"/>
       <w:lvlText w:val=""/>
       <w:lvlJc w:val="left"/>
     </w:lvl>
   </w:abstractNum>
-  <w:abstractNum w:abstractNumId="1" w15:restartNumberingAfterBreak="0">
-    <w:nsid w:val="64380F0C"/>
+  <w:abstractNum w:abstractNumId="2" w15:restartNumberingAfterBreak="0">
+    <w:nsid w:val="6017286B"/>
     <w:multiLevelType w:val="hybridMultilevel"/>
-    <w:tmpl w:val="E962FC40"/>
-    <w:lvl w:ilvl="0" w:tplc="CCC67318" w:tentative="1">
+    <w:tmpl w:val="C7E6558A"/>
+    <w:lvl w:ilvl="0" w:tplc="E6FAC0D2" w:tentative="1">
       <w:start w:val="1"/>
       <w:numFmt w:val="bullet"/>
       <w:lvlText w:val="●"/>
@@ -12593,7 +13061,7 @@
         <w:ind w:left="720" w:hanging="360"/>
       </w:pPr>
     </w:lvl>
-    <w:lvl w:ilvl="1" w:tplc="EC1CB2CC" w:tentative="1">
+    <w:lvl w:ilvl="1" w:tplc="B394C8AE" w:tentative="1">
       <w:start w:val="1"/>
       <w:numFmt w:val="bullet"/>
       <w:lvlText w:val="○"/>
@@ -12602,7 +13070,7 @@
         <w:ind w:left="1440" w:hanging="360"/>
       </w:pPr>
     </w:lvl>
-    <w:lvl w:ilvl="2" w:tplc="B8482178" w:tentative="1">
+    <w:lvl w:ilvl="2" w:tplc="6B20404C" w:tentative="1">
       <w:start w:val="1"/>
       <w:numFmt w:val="bullet"/>
       <w:lvlText w:val="■"/>
@@ -12611,7 +13079,7 @@
         <w:ind w:left="2160" w:hanging="360"/>
       </w:pPr>
     </w:lvl>
-    <w:lvl w:ilvl="3" w:tplc="42F085AC" w:tentative="1">
+    <w:lvl w:ilvl="3" w:tplc="25F6B802" w:tentative="1">
       <w:start w:val="1"/>
       <w:numFmt w:val="bullet"/>
       <w:lvlText w:val="●"/>
@@ -12620,7 +13088,7 @@
         <w:ind w:left="2880" w:hanging="360"/>
       </w:pPr>
     </w:lvl>
-    <w:lvl w:ilvl="4" w:tplc="955ED6A0" w:tentative="1">
+    <w:lvl w:ilvl="4" w:tplc="93862A52" w:tentative="1">
       <w:start w:val="1"/>
       <w:numFmt w:val="bullet"/>
       <w:lvlText w:val="○"/>
@@ -12629,7 +13097,7 @@
         <w:ind w:left="3600" w:hanging="360"/>
       </w:pPr>
     </w:lvl>
-    <w:lvl w:ilvl="5" w:tplc="3E940CCE" w:tentative="1">
+    <w:lvl w:ilvl="5" w:tplc="16867EA6" w:tentative="1">
       <w:start w:val="1"/>
       <w:numFmt w:val="bullet"/>
       <w:lvlText w:val="■"/>
@@ -12638,7 +13106,7 @@
         <w:ind w:left="4320" w:hanging="360"/>
       </w:pPr>
     </w:lvl>
-    <w:lvl w:ilvl="6" w:tplc="BAFE156E" w:tentative="1">
+    <w:lvl w:ilvl="6" w:tplc="37FC3CC2" w:tentative="1">
       <w:start w:val="1"/>
       <w:numFmt w:val="bullet"/>
       <w:lvlText w:val="●"/>
@@ -12647,7 +13115,7 @@
         <w:ind w:left="5040" w:hanging="360"/>
       </w:pPr>
     </w:lvl>
-    <w:lvl w:ilvl="7" w:tplc="854AF0CC" w:tentative="1">
+    <w:lvl w:ilvl="7" w:tplc="6AC692FC" w:tentative="1">
       <w:start w:val="1"/>
       <w:numFmt w:val="bullet"/>
       <w:lvlText w:val="●"/>
@@ -12656,7 +13124,7 @@
         <w:ind w:left="5760" w:hanging="360"/>
       </w:pPr>
     </w:lvl>
-    <w:lvl w:ilvl="8" w:tplc="54583602" w:tentative="1">
+    <w:lvl w:ilvl="8" w:tplc="35881C50" w:tentative="1">
       <w:start w:val="1"/>
       <w:numFmt w:val="bullet"/>
       <w:lvlText w:val="●"/>
@@ -12666,74 +13134,20 @@
       </w:pPr>
     </w:lvl>
   </w:abstractNum>
-  <w:abstractNum w:abstractNumId="2" w15:restartNumberingAfterBreak="0">
-    <w:nsid w:val="70BA61FB"/>
-    <w:multiLevelType w:val="hybridMultilevel"/>
-    <w:tmpl w:val="7090D3D6"/>
-    <w:lvl w:ilvl="0" w:tplc="449469B4">
-      <w:start w:val="1"/>
-      <w:numFmt w:val="decimal"/>
-      <w:lvlText w:val="%1."/>
-      <w:lvlJc w:val="left"/>
-      <w:pPr>
-        <w:ind w:left="540" w:hanging="300"/>
-      </w:pPr>
-    </w:lvl>
-    <w:lvl w:ilvl="1" w:tplc="9D508C9E">
-      <w:numFmt w:val="decimal"/>
-      <w:lvlText w:val=""/>
-      <w:lvlJc w:val="left"/>
-    </w:lvl>
-    <w:lvl w:ilvl="2" w:tplc="FCEA4A84">
-      <w:numFmt w:val="decimal"/>
-      <w:lvlText w:val=""/>
-      <w:lvlJc w:val="left"/>
-    </w:lvl>
-    <w:lvl w:ilvl="3" w:tplc="1032C10E">
-      <w:numFmt w:val="decimal"/>
-      <w:lvlText w:val=""/>
-      <w:lvlJc w:val="left"/>
-    </w:lvl>
-    <w:lvl w:ilvl="4" w:tplc="C5563194">
-      <w:numFmt w:val="decimal"/>
-      <w:lvlText w:val=""/>
-      <w:lvlJc w:val="left"/>
-    </w:lvl>
-    <w:lvl w:ilvl="5" w:tplc="5650A44C">
-      <w:numFmt w:val="decimal"/>
-      <w:lvlText w:val=""/>
-      <w:lvlJc w:val="left"/>
-    </w:lvl>
-    <w:lvl w:ilvl="6" w:tplc="688C5AC4">
-      <w:numFmt w:val="decimal"/>
-      <w:lvlText w:val=""/>
-      <w:lvlJc w:val="left"/>
-    </w:lvl>
-    <w:lvl w:ilvl="7" w:tplc="7C6242E6">
-      <w:numFmt w:val="decimal"/>
-      <w:lvlText w:val=""/>
-      <w:lvlJc w:val="left"/>
-    </w:lvl>
-    <w:lvl w:ilvl="8" w:tplc="EAB6C7DE">
-      <w:numFmt w:val="decimal"/>
-      <w:lvlText w:val=""/>
-      <w:lvlJc w:val="left"/>
-    </w:lvl>
-  </w:abstractNum>
-  <w:num w:numId="1" w16cid:durableId="1381176224">
+  <w:num w:numId="1" w16cid:durableId="1204488929">
+    <w:abstractNumId w:val="2"/>
+    <w:lvlOverride w:ilvl="0">
+      <w:startOverride w:val="1"/>
+    </w:lvlOverride>
+  </w:num>
+  <w:num w:numId="2" w16cid:durableId="871766744">
     <w:abstractNumId w:val="1"/>
     <w:lvlOverride w:ilvl="0">
       <w:startOverride w:val="1"/>
     </w:lvlOverride>
   </w:num>
-  <w:num w:numId="2" w16cid:durableId="2518059">
+  <w:num w:numId="3" w16cid:durableId="1788042567">
     <w:abstractNumId w:val="0"/>
-    <w:lvlOverride w:ilvl="0">
-      <w:startOverride w:val="1"/>
-    </w:lvlOverride>
-  </w:num>
-  <w:num w:numId="3" w16cid:durableId="1548687082">
-    <w:abstractNumId w:val="2"/>
     <w:lvlOverride w:ilvl="0">
       <w:startOverride w:val="1"/>
     </w:lvlOverride>

</xml_diff>